<commit_message>
fix(docs): perfect academic PDF and DOCX export with KaTeX vector math and pagination
</commit_message>
<xml_diff>
--- a/knowledge_base/domains/computer_science/referat_binary_numeral_systems.docx
+++ b/knowledge_base/domains/computer_science/referat_binary_numeral_systems.docx
@@ -16,9 +16,9 @@
       <w:pPr>
         <w:pStyle w:val="Heading2"/>
       </w:pPr>
-      <w:bookmarkStart w:id="10" w:name="_db20da6c5e54c6e733f39ef89c81176af058bec"/>
-      <w:r>
-        <w:t xml:space="preserve">НАЦІОНАЛЬНИЙ УНІВЕРСИТЕТ</w:t>
+      <w:bookmarkStart w:id="10" w:name="_748303cd949c910233612a696e24f6f880013dc"/>
+      <w:r>
+        <w:t xml:space="preserve">НАЦІОНАЛЬНИЙ ТЕХНІЧНИЙ УНІВЕРСИТЕТ УКРАЇНИ</w:t>
       </w:r>
       <w:bookmarkEnd w:id="10"/>
     </w:p>
@@ -26,9 +26,9 @@
       <w:pPr>
         <w:pStyle w:val="Heading3"/>
       </w:pPr>
-      <w:bookmarkStart w:id="11" w:name="_42eb2ccfcb39269cc4b2bf02fc42729a8066896"/>
-      <w:r>
-        <w:t xml:space="preserve">Факультет комп’ютерних наук та програмної інженерії</w:t>
+      <w:bookmarkStart w:id="11" w:name="_1217846ddf7c9cff7186f30e4d1be9be2de32c6"/>
+      <w:r>
+        <w:t xml:space="preserve">«КИЇВСЬКИЙ ПОЛІТЕХНІЧНИЙ ІНСТИТУТ ІМЕНІ ІГОРЯ СІКОРСЬКОГО»</w:t>
       </w:r>
       <w:bookmarkEnd w:id="11"/>
     </w:p>
@@ -36,14 +36,24 @@
       <w:pPr>
         <w:pStyle w:val="Heading3"/>
       </w:pPr>
-      <w:bookmarkStart w:id="12" w:name="_e2b669f427878d85fc81609569eda6732e49fa1"/>
-      <w:r>
-        <w:t xml:space="preserve">Кафедра обчислювальної техніки та вбудованих систем</w:t>
+      <w:bookmarkStart w:id="12" w:name="_6dd4b7382728f31383be39030302cf0b252a2a5"/>
+      <w:r>
+        <w:t xml:space="preserve">Факультет інформатики та обчислювальної техніки</w:t>
       </w:r>
       <w:bookmarkEnd w:id="12"/>
     </w:p>
     <w:p>
       <w:pPr>
+        <w:pStyle w:val="Heading3"/>
+      </w:pPr>
+      <w:bookmarkStart w:id="13" w:name="_7db43cc9e6715f38eef3922298a484c84531fa4"/>
+      <w:r>
+        <w:t xml:space="preserve">Кафедра обчислювальної техніки</w:t>
+      </w:r>
+      <w:bookmarkEnd w:id="13"/>
+    </w:p>
+    <w:p>
+      <w:pPr>
         <w:pStyle w:val="FirstParagraph"/>
       </w:pPr>
     </w:p>
@@ -51,37 +61,37 @@
       <w:pPr>
         <w:pStyle w:val="Heading1"/>
       </w:pPr>
-      <w:bookmarkStart w:id="13" w:name="_реферат"/>
+      <w:bookmarkStart w:id="14" w:name="_реферат"/>
       <w:r>
         <w:t xml:space="preserve">РЕФЕРАТ</w:t>
       </w:r>
-      <w:bookmarkEnd w:id="13"/>
+      <w:bookmarkEnd w:id="14"/>
     </w:p>
     <w:p>
       <w:pPr>
         <w:pStyle w:val="Heading3"/>
       </w:pPr>
-      <w:bookmarkStart w:id="14" w:name="_900ae976eb8890b2c80a8314b8c21fac1347ec8"/>
+      <w:bookmarkStart w:id="15" w:name="_900ae976eb8890b2c80a8314b8c21fac1347ec8"/>
       <w:r>
         <w:t xml:space="preserve">з дисципліни: «Архітектура комп’ютерних систем та основи схемотехніки»</w:t>
       </w:r>
-      <w:bookmarkEnd w:id="14"/>
+      <w:bookmarkEnd w:id="15"/>
     </w:p>
     <w:p>
       <w:pPr>
         <w:pStyle w:val="Heading2"/>
       </w:pPr>
-      <w:bookmarkStart w:id="15" w:name="_48175b4d4e86d4a48cb1df0b074224f613b712b"/>
+      <w:bookmarkStart w:id="16" w:name="_48175b4d4e86d4a48cb1df0b074224f613b712b"/>
       <w:r>
         <w:t xml:space="preserve">на тему:</w:t>
       </w:r>
-      <w:bookmarkEnd w:id="15"/>
+      <w:bookmarkEnd w:id="16"/>
     </w:p>
     <w:p>
       <w:pPr>
         <w:pStyle w:val="Heading1"/>
       </w:pPr>
-      <w:bookmarkStart w:id="16" w:name="_6c293083c46c5c89666f6824ebfe4ce1bc2255a"/>
+      <w:bookmarkStart w:id="17" w:name="_6c293083c46c5c89666f6824ebfe4ce1bc2255a"/>
       <w:r>
         <w:rPr>
           <w:b/>
@@ -89,7 +99,7 @@
         </w:rPr>
         <w:t xml:space="preserve">«Системи числення, двійкова арифметика та принципи машинного представлення даних в обчислювальних системах»</w:t>
       </w:r>
-      <w:bookmarkEnd w:id="16"/>
+      <w:bookmarkEnd w:id="17"/>
     </w:p>
     <w:p>
       <w:pPr>
@@ -121,7 +131,7 @@
           <w:i/>
           <w:iCs/>
         </w:rPr>
-        <w:t xml:space="preserve">Прізвище, Ім’я, По батькові</w:t>
+        <w:t xml:space="preserve">Іваненко Іван Іванович</w:t>
       </w:r>
     </w:p>
     <w:p>
@@ -149,7 +159,7 @@
           <w:i/>
           <w:iCs/>
         </w:rPr>
-        <w:t xml:space="preserve">Прізвище, Ініціали</w:t>
+        <w:t xml:space="preserve">Петренко Петро Петрович</w:t>
       </w:r>
     </w:p>
     <w:p>
@@ -161,11 +171,11 @@
       <w:pPr>
         <w:pStyle w:val="Heading3"/>
       </w:pPr>
-      <w:bookmarkStart w:id="17" w:name="_1fd1855594d4e2a70e9f7943f6bd5716f678184"/>
+      <w:bookmarkStart w:id="18" w:name="_1fd1855594d4e2a70e9f7943f6bd5716f678184"/>
       <w:r>
         <w:t xml:space="preserve">Київ — 2026</w:t>
       </w:r>
-      <w:bookmarkEnd w:id="17"/>
+      <w:bookmarkEnd w:id="18"/>
     </w:p>
     <w:p>
       <w:r>
@@ -178,11 +188,11 @@
       <w:pPr>
         <w:pStyle w:val="Heading1"/>
       </w:pPr>
-      <w:bookmarkStart w:id="18" w:name="_зміст"/>
+      <w:bookmarkStart w:id="19" w:name="_зміст"/>
       <w:r>
         <w:t xml:space="preserve">ЗМІСТ</w:t>
       </w:r>
-      <w:bookmarkEnd w:id="18"/>
+      <w:bookmarkEnd w:id="19"/>
     </w:p>
     <w:p>
       <w:pPr>
@@ -457,11 +467,11 @@
       <w:pPr>
         <w:pStyle w:val="Heading1"/>
       </w:pPr>
-      <w:bookmarkStart w:id="19" w:name="_вступ"/>
+      <w:bookmarkStart w:id="20" w:name="_вступ"/>
       <w:r>
         <w:t xml:space="preserve">ВСТУП</w:t>
       </w:r>
-      <w:bookmarkEnd w:id="19"/>
+      <w:bookmarkEnd w:id="20"/>
     </w:p>
     <w:p>
       <w:pPr>
@@ -571,35 +581,65 @@
         </w:rPr>
         <w:t xml:space="preserve">Завдання дослідження:</w:t>
       </w:r>
-      <w:r>
-        <w:t xml:space="preserve"> </w:t>
-      </w:r>
-      <w:r>
-        <w:t xml:space="preserve">1. Розкрити фундаментальні відмінності між непозиційними та позиційними системами числення, вивести поліноміальну розгорнуту форму числа.</w:t>
-      </w:r>
-      <w:r>
-        <w:t xml:space="preserve"> </w:t>
-      </w:r>
-      <w:r>
-        <w:t xml:space="preserve">2. Проаналізувати фізичні, математичні та економічні причини вибору двійкової системи як бази цифрової електроніки.</w:t>
-      </w:r>
-      <w:r>
-        <w:t xml:space="preserve"> </w:t>
-      </w:r>
-      <w:r>
-        <w:t xml:space="preserve">3. Охарактеризувати вісімкову та шістнадцяткову системи числення як засоби ущільнення двійкової інформації.</w:t>
-      </w:r>
-      <w:r>
-        <w:t xml:space="preserve"> </w:t>
-      </w:r>
-      <w:r>
-        <w:t xml:space="preserve">4. Дослідити алгоритми міжсистемного переводу цілих і дробових величин, показавши природу виникнення похибок при роботі з дійсними числами.</w:t>
-      </w:r>
-      <w:r>
-        <w:t xml:space="preserve"> </w:t>
-      </w:r>
-      <w:r>
-        <w:t xml:space="preserve">5. Опанувати методику порозрядного двійкового додавання й множення, а також довести математичну ефективність використання додаткового коду для усунення операції віднімання на рівні АЛП.</w:t>
+    </w:p>
+    <w:p>
+      <w:pPr>
+        <w:pStyle w:val="Compact"/>
+        <w:numPr>
+          <w:ilvl w:val="0"/>
+          <w:numId w:val="1005"/>
+        </w:numPr>
+      </w:pPr>
+      <w:r>
+        <w:t xml:space="preserve">Розкрити фундаментальні відмінності між непозиційними та позиційними системами числення, вивести поліноміальну розгорнуту форму числа.</w:t>
+      </w:r>
+    </w:p>
+    <w:p>
+      <w:pPr>
+        <w:pStyle w:val="Compact"/>
+        <w:numPr>
+          <w:ilvl w:val="0"/>
+          <w:numId w:val="1005"/>
+        </w:numPr>
+      </w:pPr>
+      <w:r>
+        <w:t xml:space="preserve">Проаналізувати фізичні, математичні та економічні причини вибору двійкової системи як бази цифрової електроніки.</w:t>
+      </w:r>
+    </w:p>
+    <w:p>
+      <w:pPr>
+        <w:pStyle w:val="Compact"/>
+        <w:numPr>
+          <w:ilvl w:val="0"/>
+          <w:numId w:val="1005"/>
+        </w:numPr>
+      </w:pPr>
+      <w:r>
+        <w:t xml:space="preserve">Охарактеризувати вісімкову та шістнадцяткову системи числення як засоби ущільнення двійкової інформації.</w:t>
+      </w:r>
+    </w:p>
+    <w:p>
+      <w:pPr>
+        <w:pStyle w:val="Compact"/>
+        <w:numPr>
+          <w:ilvl w:val="0"/>
+          <w:numId w:val="1005"/>
+        </w:numPr>
+      </w:pPr>
+      <w:r>
+        <w:t xml:space="preserve">Дослідити алгоритми міжсистемного переводу цілих і дробових величин, показавши природу виникнення похибок при роботі з дійсними числами.</w:t>
+      </w:r>
+    </w:p>
+    <w:p>
+      <w:pPr>
+        <w:pStyle w:val="Compact"/>
+        <w:numPr>
+          <w:ilvl w:val="0"/>
+          <w:numId w:val="1005"/>
+        </w:numPr>
+      </w:pPr>
+      <w:r>
+        <w:t xml:space="preserve">Опанувати методику порозрядного двійкового додавання й множення, а також довести математичну ефективність використання додаткового коду для усунення операції віднімання на рівні АЛП.</w:t>
       </w:r>
     </w:p>
     <w:p>
@@ -613,21 +653,21 @@
       <w:pPr>
         <w:pStyle w:val="Heading1"/>
       </w:pPr>
-      <w:bookmarkStart w:id="20" w:name="_bac806115340f8cf619449c01c8496bd57c2dec"/>
+      <w:bookmarkStart w:id="21" w:name="_bac806115340f8cf619449c01c8496bd57c2dec"/>
       <w:r>
         <w:t xml:space="preserve">РОЗДІЛ 1. ЗАГАЛЬНІ ВІДОМОСТІ ПРО СИСТЕМИ ЧИСЛЕННЯ</w:t>
       </w:r>
-      <w:bookmarkEnd w:id="20"/>
+      <w:bookmarkEnd w:id="21"/>
     </w:p>
     <w:p>
       <w:pPr>
         <w:pStyle w:val="Heading2"/>
       </w:pPr>
-      <w:bookmarkStart w:id="21" w:name="_236530c677ebea9177e0eee756b29f866e2a1c4"/>
+      <w:bookmarkStart w:id="22" w:name="_236530c677ebea9177e0eee756b29f866e2a1c4"/>
       <w:r>
         <w:t xml:space="preserve">1.1. Поняття системи числення. Непозиційні та позиційні системи</w:t>
       </w:r>
-      <w:bookmarkEnd w:id="21"/>
+      <w:bookmarkEnd w:id="22"/>
     </w:p>
     <w:p>
       <w:pPr>
@@ -714,11 +754,11 @@
       <w:pPr>
         <w:pStyle w:val="Heading3"/>
       </w:pPr>
-      <w:bookmarkStart w:id="22" w:name="_7ff63845f330203d2162e6ef3670d5d787464a9"/>
+      <w:bookmarkStart w:id="23" w:name="_7ff63845f330203d2162e6ef3670d5d787464a9"/>
       <w:r>
         <w:t xml:space="preserve">Непозиційні системи числення</w:t>
       </w:r>
-      <w:bookmarkEnd w:id="22"/>
+      <w:bookmarkEnd w:id="23"/>
     </w:p>
     <w:p>
       <w:pPr>
@@ -764,15 +804,15 @@
       <w:r>
         <w:t xml:space="preserve">, що використовує латинські літери:</w:t>
       </w:r>
-      <w:r>
-        <w:t xml:space="preserve"> </w:t>
-      </w:r>
-      <w:r>
-        <w:t xml:space="preserve">-</w:t>
-      </w:r>
-      <w:r>
-        <w:t xml:space="preserve"> </w:t>
-      </w:r>
+    </w:p>
+    <w:p>
+      <w:pPr>
+        <w:pStyle w:val="Compact"/>
+        <w:numPr>
+          <w:ilvl w:val="0"/>
+          <w:numId w:val="1006"/>
+        </w:numPr>
+      </w:pPr>
       <m:oMath>
         <m:r>
           <m:rPr>
@@ -791,14 +831,17 @@
         </m:r>
       </m:oMath>
       <w:r>
-        <w:t xml:space="preserve"> </w:t>
-      </w:r>
-      <w:r>
-        <w:t xml:space="preserve">-</w:t>
-      </w:r>
-      <w:r>
-        <w:t xml:space="preserve"> </w:t>
-      </w:r>
+        <w:t xml:space="preserve">​</w:t>
+      </w:r>
+    </w:p>
+    <w:p>
+      <w:pPr>
+        <w:pStyle w:val="Compact"/>
+        <w:numPr>
+          <w:ilvl w:val="0"/>
+          <w:numId w:val="1006"/>
+        </w:numPr>
+      </w:pPr>
       <m:oMath>
         <m:r>
           <m:rPr>
@@ -817,14 +860,17 @@
         </m:r>
       </m:oMath>
       <w:r>
-        <w:t xml:space="preserve"> </w:t>
-      </w:r>
-      <w:r>
-        <w:t xml:space="preserve">-</w:t>
-      </w:r>
-      <w:r>
-        <w:t xml:space="preserve"> </w:t>
-      </w:r>
+        <w:t xml:space="preserve">​</w:t>
+      </w:r>
+    </w:p>
+    <w:p>
+      <w:pPr>
+        <w:pStyle w:val="Compact"/>
+        <w:numPr>
+          <w:ilvl w:val="0"/>
+          <w:numId w:val="1006"/>
+        </w:numPr>
+      </w:pPr>
       <m:oMath>
         <m:r>
           <m:rPr>
@@ -843,14 +889,17 @@
         </m:r>
       </m:oMath>
       <w:r>
-        <w:t xml:space="preserve"> </w:t>
-      </w:r>
-      <w:r>
-        <w:t xml:space="preserve">-</w:t>
-      </w:r>
-      <w:r>
-        <w:t xml:space="preserve"> </w:t>
-      </w:r>
+        <w:t xml:space="preserve">​</w:t>
+      </w:r>
+    </w:p>
+    <w:p>
+      <w:pPr>
+        <w:pStyle w:val="Compact"/>
+        <w:numPr>
+          <w:ilvl w:val="0"/>
+          <w:numId w:val="1006"/>
+        </w:numPr>
+      </w:pPr>
       <m:oMath>
         <m:r>
           <m:rPr>
@@ -869,14 +918,17 @@
         </m:r>
       </m:oMath>
       <w:r>
-        <w:t xml:space="preserve"> </w:t>
-      </w:r>
-      <w:r>
-        <w:t xml:space="preserve">-</w:t>
-      </w:r>
-      <w:r>
-        <w:t xml:space="preserve"> </w:t>
-      </w:r>
+        <w:t xml:space="preserve">​</w:t>
+      </w:r>
+    </w:p>
+    <w:p>
+      <w:pPr>
+        <w:pStyle w:val="Compact"/>
+        <w:numPr>
+          <w:ilvl w:val="0"/>
+          <w:numId w:val="1006"/>
+        </w:numPr>
+      </w:pPr>
       <m:oMath>
         <m:r>
           <m:rPr>
@@ -895,14 +947,17 @@
         </m:r>
       </m:oMath>
       <w:r>
-        <w:t xml:space="preserve"> </w:t>
-      </w:r>
-      <w:r>
-        <w:t xml:space="preserve">-</w:t>
-      </w:r>
-      <w:r>
-        <w:t xml:space="preserve"> </w:t>
-      </w:r>
+        <w:t xml:space="preserve">​</w:t>
+      </w:r>
+    </w:p>
+    <w:p>
+      <w:pPr>
+        <w:pStyle w:val="Compact"/>
+        <w:numPr>
+          <w:ilvl w:val="0"/>
+          <w:numId w:val="1006"/>
+        </w:numPr>
+      </w:pPr>
       <m:oMath>
         <m:r>
           <m:rPr>
@@ -921,14 +976,17 @@
         </m:r>
       </m:oMath>
       <w:r>
-        <w:t xml:space="preserve"> </w:t>
-      </w:r>
-      <w:r>
-        <w:t xml:space="preserve">-</w:t>
-      </w:r>
-      <w:r>
-        <w:t xml:space="preserve"> </w:t>
-      </w:r>
+        <w:t xml:space="preserve">​</w:t>
+      </w:r>
+    </w:p>
+    <w:p>
+      <w:pPr>
+        <w:pStyle w:val="Compact"/>
+        <w:numPr>
+          <w:ilvl w:val="0"/>
+          <w:numId w:val="1006"/>
+        </w:numPr>
+      </w:pPr>
       <m:oMath>
         <m:r>
           <m:rPr>
@@ -946,10 +1004,13 @@
           <m:t>1000</m:t>
         </m:r>
       </m:oMath>
-    </w:p>
-    <w:p>
-      <w:pPr>
-        <w:pStyle w:val="BodyText"/>
+      <w:r>
+        <w:t xml:space="preserve">​</w:t>
+      </w:r>
+    </w:p>
+    <w:p>
+      <w:pPr>
+        <w:pStyle w:val="FirstParagraph"/>
       </w:pPr>
       <w:r>
         <w:t xml:space="preserve">Значення числа в римській системі визначається простим сумуванням значень цифр (якщо менша цифра стоїть праворуч від більшої:</w:t>
@@ -1048,15 +1109,15 @@
         </w:rPr>
         <w:t xml:space="preserve">Критичні недоліки непозиційних систем:</w:t>
       </w:r>
-      <w:r>
-        <w:t xml:space="preserve"> </w:t>
-      </w:r>
-      <w:r>
-        <w:t xml:space="preserve">1.</w:t>
-      </w:r>
-      <w:r>
-        <w:t xml:space="preserve"> </w:t>
-      </w:r>
+    </w:p>
+    <w:p>
+      <w:pPr>
+        <w:pStyle w:val="Compact"/>
+        <w:numPr>
+          <w:ilvl w:val="0"/>
+          <w:numId w:val="1007"/>
+        </w:numPr>
+      </w:pPr>
       <w:r>
         <w:rPr>
           <w:b/>
@@ -1070,15 +1131,15 @@
       <w:r>
         <w:t xml:space="preserve">як повноправної цифри, що позначає відсутність розряду або порожню величину.</w:t>
       </w:r>
-      <w:r>
-        <w:t xml:space="preserve"> </w:t>
-      </w:r>
-      <w:r>
-        <w:t xml:space="preserve">2.</w:t>
-      </w:r>
-      <w:r>
-        <w:t xml:space="preserve"> </w:t>
-      </w:r>
+    </w:p>
+    <w:p>
+      <w:pPr>
+        <w:pStyle w:val="Compact"/>
+        <w:numPr>
+          <w:ilvl w:val="0"/>
+          <w:numId w:val="1007"/>
+        </w:numPr>
+      </w:pPr>
       <w:r>
         <w:rPr>
           <w:b/>
@@ -1092,15 +1153,15 @@
       <w:r>
         <w:t xml:space="preserve">без введення нескінченної множини нових символів.</w:t>
       </w:r>
-      <w:r>
-        <w:t xml:space="preserve"> </w:t>
-      </w:r>
-      <w:r>
-        <w:t xml:space="preserve">3.</w:t>
-      </w:r>
-      <w:r>
-        <w:t xml:space="preserve"> </w:t>
-      </w:r>
+    </w:p>
+    <w:p>
+      <w:pPr>
+        <w:pStyle w:val="Compact"/>
+        <w:numPr>
+          <w:ilvl w:val="0"/>
+          <w:numId w:val="1007"/>
+        </w:numPr>
+      </w:pPr>
       <w:r>
         <w:rPr>
           <w:b/>
@@ -1142,11 +1203,11 @@
       <w:pPr>
         <w:pStyle w:val="Heading3"/>
       </w:pPr>
-      <w:bookmarkStart w:id="23" w:name="_7d457b810f65204819130e61faede3a70f10f84"/>
+      <w:bookmarkStart w:id="24" w:name="_7d457b810f65204819130e61faede3a70f10f84"/>
       <w:r>
         <w:t xml:space="preserve">Позиційні системи числення</w:t>
       </w:r>
-      <w:bookmarkEnd w:id="23"/>
+      <w:bookmarkEnd w:id="24"/>
     </w:p>
     <w:p>
       <w:pPr>
@@ -1341,11 +1402,11 @@
       <w:pPr>
         <w:pStyle w:val="Heading2"/>
       </w:pPr>
-      <w:bookmarkStart w:id="24" w:name="_0aae90266af611f22a128d8df76b1475c7c18ed"/>
+      <w:bookmarkStart w:id="25" w:name="_0aae90266af611f22a128d8df76b1475c7c18ed"/>
       <w:r>
         <w:t xml:space="preserve">1.2. Базові характеристики позиційних систем числення</w:t>
       </w:r>
-      <w:bookmarkEnd w:id="24"/>
+      <w:bookmarkEnd w:id="25"/>
     </w:p>
     <w:p>
       <w:pPr>
@@ -1354,15 +1415,15 @@
       <w:r>
         <w:t xml:space="preserve">Кожна позиційна система числення однозначно характеризується трьома фундаментальними параметрами:</w:t>
       </w:r>
-      <w:r>
-        <w:t xml:space="preserve"> </w:t>
-      </w:r>
-      <w:r>
-        <w:t xml:space="preserve">1.</w:t>
-      </w:r>
-      <w:r>
-        <w:t xml:space="preserve"> </w:t>
-      </w:r>
+    </w:p>
+    <w:p>
+      <w:pPr>
+        <w:pStyle w:val="FirstParagraph"/>
+        <w:numPr>
+          <w:ilvl w:val="0"/>
+          <w:numId w:val="1008"/>
+        </w:numPr>
+      </w:pPr>
       <w:r>
         <w:rPr>
           <w:b/>
@@ -1405,15 +1466,15 @@
       <w:r>
         <w:t xml:space="preserve">), що дорівнює кількості елементарних цифр в алфавіті даної системи, а також показує, у скільки разів одиниця наступного (старшого) розряду більша за одиницю поточного розряду.</w:t>
       </w:r>
-      <w:r>
-        <w:t xml:space="preserve"> </w:t>
-      </w:r>
-      <w:r>
-        <w:t xml:space="preserve">2.</w:t>
-      </w:r>
-      <w:r>
-        <w:t xml:space="preserve"> </w:t>
-      </w:r>
+    </w:p>
+    <w:p>
+      <w:pPr>
+        <w:pStyle w:val="FirstParagraph"/>
+        <w:numPr>
+          <w:ilvl w:val="0"/>
+          <w:numId w:val="1008"/>
+        </w:numPr>
+      </w:pPr>
       <w:r>
         <w:rPr>
           <w:b/>
@@ -1595,6 +1656,7 @@
     <w:p>
       <w:pPr>
         <w:pStyle w:val="FirstParagraph"/>
+        <w:ind w:left="720" w:firstLine="0"/>
       </w:pPr>
       <w:r>
         <w:t xml:space="preserve">Для систем з основою</w:t>
@@ -1757,15 +1819,15 @@
       <w:r>
         <w:t xml:space="preserve">тощо).</w:t>
       </w:r>
-      <w:r>
-        <w:t xml:space="preserve"> </w:t>
-      </w:r>
-      <w:r>
-        <w:t xml:space="preserve">3.</w:t>
-      </w:r>
-      <w:r>
-        <w:t xml:space="preserve"> </w:t>
-      </w:r>
+    </w:p>
+    <w:p>
+      <w:pPr>
+        <w:pStyle w:val="FirstParagraph"/>
+        <w:numPr>
+          <w:ilvl w:val="0"/>
+          <w:numId w:val="1008"/>
+        </w:numPr>
+      </w:pPr>
       <w:r>
         <w:rPr>
           <w:b/>
@@ -1818,11 +1880,11 @@
       <w:pPr>
         <w:pStyle w:val="Heading3"/>
       </w:pPr>
-      <w:bookmarkStart w:id="25" w:name="_b1b520bcd89386916ee280e50712ebb417c9100"/>
+      <w:bookmarkStart w:id="26" w:name="_b1b520bcd89386916ee280e50712ebb417c9100"/>
       <w:r>
         <w:t xml:space="preserve">Розгорнута форма запису числа</w:t>
       </w:r>
-      <w:bookmarkEnd w:id="25"/>
+      <w:bookmarkEnd w:id="26"/>
     </w:p>
     <w:p>
       <w:pPr>
@@ -2446,15 +2508,15 @@
       <w:r>
         <w:t xml:space="preserve">де:</w:t>
       </w:r>
-      <w:r>
-        <w:t xml:space="preserve"> </w:t>
-      </w:r>
-      <w:r>
-        <w:t xml:space="preserve">-</w:t>
-      </w:r>
-      <w:r>
-        <w:t xml:space="preserve"> </w:t>
-      </w:r>
+    </w:p>
+    <w:p>
+      <w:pPr>
+        <w:pStyle w:val="Compact"/>
+        <w:numPr>
+          <w:ilvl w:val="0"/>
+          <w:numId w:val="1009"/>
+        </w:numPr>
+      </w:pPr>
       <m:oMath>
         <m:r>
           <m:t>b</m:t>
@@ -2466,15 +2528,15 @@
       <w:r>
         <w:t xml:space="preserve">— основа системи числення;</w:t>
       </w:r>
-      <w:r>
-        <w:t xml:space="preserve"> </w:t>
-      </w:r>
-      <w:r>
-        <w:t xml:space="preserve">-</w:t>
-      </w:r>
-      <w:r>
-        <w:t xml:space="preserve"> </w:t>
-      </w:r>
+    </w:p>
+    <w:p>
+      <w:pPr>
+        <w:pStyle w:val="Compact"/>
+        <w:numPr>
+          <w:ilvl w:val="0"/>
+          <w:numId w:val="1009"/>
+        </w:numPr>
+      </w:pPr>
       <m:oMath>
         <m:sSub>
           <m:e>
@@ -2568,15 +2630,15 @@
       <w:r>
         <w:t xml:space="preserve">);</w:t>
       </w:r>
-      <w:r>
-        <w:t xml:space="preserve"> </w:t>
-      </w:r>
-      <w:r>
-        <w:t xml:space="preserve">-</w:t>
-      </w:r>
-      <w:r>
-        <w:t xml:space="preserve"> </w:t>
-      </w:r>
+    </w:p>
+    <w:p>
+      <w:pPr>
+        <w:pStyle w:val="Compact"/>
+        <w:numPr>
+          <w:ilvl w:val="0"/>
+          <w:numId w:val="1009"/>
+        </w:numPr>
+      </w:pPr>
       <m:oMath>
         <m:r>
           <m:t>n</m:t>
@@ -2588,15 +2650,15 @@
       <w:r>
         <w:t xml:space="preserve">— кількість розрядів у цілій частині числа;</w:t>
       </w:r>
-      <w:r>
-        <w:t xml:space="preserve"> </w:t>
-      </w:r>
-      <w:r>
-        <w:t xml:space="preserve">-</w:t>
-      </w:r>
-      <w:r>
-        <w:t xml:space="preserve"> </w:t>
-      </w:r>
+    </w:p>
+    <w:p>
+      <w:pPr>
+        <w:pStyle w:val="Compact"/>
+        <w:numPr>
+          <w:ilvl w:val="0"/>
+          <w:numId w:val="1009"/>
+        </w:numPr>
+      </w:pPr>
       <m:oMath>
         <m:r>
           <m:t>m</m:t>
@@ -2608,15 +2670,15 @@
       <w:r>
         <w:t xml:space="preserve">— кількість розрядів у дробовій частині числа;</w:t>
       </w:r>
-      <w:r>
-        <w:t xml:space="preserve"> </w:t>
-      </w:r>
-      <w:r>
-        <w:t xml:space="preserve">-</w:t>
-      </w:r>
-      <w:r>
-        <w:t xml:space="preserve"> </w:t>
-      </w:r>
+    </w:p>
+    <w:p>
+      <w:pPr>
+        <w:pStyle w:val="Compact"/>
+        <w:numPr>
+          <w:ilvl w:val="0"/>
+          <w:numId w:val="1009"/>
+        </w:numPr>
+      </w:pPr>
       <m:oMath>
         <m:r>
           <m:t>k</m:t>
@@ -2976,11 +3038,11 @@
       <w:pPr>
         <w:pStyle w:val="Heading1"/>
       </w:pPr>
-      <w:bookmarkStart w:id="26" w:name="_4958eb837d0f066f2565506ce11041859e5546d"/>
+      <w:bookmarkStart w:id="27" w:name="_4958eb837d0f066f2565506ce11041859e5546d"/>
       <w:r>
         <w:t xml:space="preserve">РОЗДІЛ 2. ОСНОВНІ КОМП’ЮТЕРНІ СИСТЕМИ ЧИСЛЕННЯ</w:t>
       </w:r>
-      <w:bookmarkEnd w:id="26"/>
+      <w:bookmarkEnd w:id="27"/>
     </w:p>
     <w:tbl>
       <w:tblPr>
@@ -3757,11 +3819,11 @@
       <w:pPr>
         <w:pStyle w:val="Heading2"/>
       </w:pPr>
-      <w:bookmarkStart w:id="27" w:name="_67fabcb161e6d7ca0ee1fd773eb1e282a7acbda"/>
+      <w:bookmarkStart w:id="28" w:name="_67fabcb161e6d7ca0ee1fd773eb1e282a7acbda"/>
       <w:r>
         <w:t xml:space="preserve">2.1. Двійкова система числення (Binary) як основа цифрової електроніки</w:t>
       </w:r>
-      <w:bookmarkEnd w:id="27"/>
+      <w:bookmarkEnd w:id="28"/>
     </w:p>
     <w:p>
       <w:pPr>
@@ -3877,18 +3939,18 @@
       <w:pPr>
         <w:pStyle w:val="Heading3"/>
       </w:pPr>
-      <w:bookmarkStart w:id="28" w:name="_216c566edbceccd8ca6da857198bb6fce02e7d8"/>
+      <w:bookmarkStart w:id="29" w:name="_216c566edbceccd8ca6da857198bb6fce02e7d8"/>
       <w:r>
         <w:t xml:space="preserve">Причини абсолютної домінації двійкової системи в ЕОМ:</w:t>
       </w:r>
-      <w:bookmarkEnd w:id="28"/>
+      <w:bookmarkEnd w:id="29"/>
     </w:p>
     <w:p>
       <w:pPr>
         <w:pStyle w:val="FirstParagraph"/>
         <w:numPr>
           <w:ilvl w:val="0"/>
-          <w:numId w:val="1005"/>
+          <w:numId w:val="1010"/>
         </w:numPr>
       </w:pPr>
       <w:r>
@@ -3910,7 +3972,7 @@
         <w:pStyle w:val="Compact"/>
         <w:numPr>
           <w:ilvl w:val="1"/>
-          <w:numId w:val="1006"/>
+          <w:numId w:val="1011"/>
         </w:numPr>
       </w:pPr>
       <w:r>
@@ -3950,7 +4012,7 @@
         <w:pStyle w:val="Compact"/>
         <w:numPr>
           <w:ilvl w:val="1"/>
-          <w:numId w:val="1006"/>
+          <w:numId w:val="1011"/>
         </w:numPr>
       </w:pPr>
       <w:r>
@@ -4075,7 +4137,7 @@
         <w:pStyle w:val="FirstParagraph"/>
         <w:numPr>
           <w:ilvl w:val="0"/>
-          <w:numId w:val="1005"/>
+          <w:numId w:val="1010"/>
         </w:numPr>
       </w:pPr>
       <w:r>
@@ -4152,7 +4214,7 @@
         <w:pStyle w:val="FirstParagraph"/>
         <w:numPr>
           <w:ilvl w:val="0"/>
-          <w:numId w:val="1005"/>
+          <w:numId w:val="1010"/>
         </w:numPr>
       </w:pPr>
       <w:r>
@@ -4171,7 +4233,7 @@
     </w:p>
     <w:p>
       <w:pPr>
-        <w:pStyle w:val="BodyText"/>
+        <w:pStyle w:val="FirstParagraph"/>
       </w:pPr>
       <m:oMathPara>
         <m:oMathParaPr>
@@ -4359,7 +4421,6 @@
     <w:p>
       <w:pPr>
         <w:pStyle w:val="FirstParagraph"/>
-        <w:ind w:left="720" w:firstLine="0"/>
       </w:pPr>
       <w:r>
         <w:t xml:space="preserve">Таблиця множення зводиться до логічного кон’юнктивного елемента</w:t>
@@ -4403,11 +4464,11 @@
       <w:pPr>
         <w:pStyle w:val="Heading2"/>
       </w:pPr>
-      <w:bookmarkStart w:id="29" w:name="_b68ce0cdf42bae6cae2db86183d8358a3575d7f"/>
+      <w:bookmarkStart w:id="30" w:name="_b68ce0cdf42bae6cae2db86183d8358a3575d7f"/>
       <w:r>
         <w:t xml:space="preserve">2.2. Вісімкова (Octal) та шістнадцяткова (Hexadecimal) системи: компактне подання машинних кодів та адрес</w:t>
       </w:r>
-      <w:bookmarkEnd w:id="29"/>
+      <w:bookmarkEnd w:id="30"/>
     </w:p>
     <w:p>
       <w:pPr>
@@ -4433,15 +4494,15 @@
       <w:r>
         <w:t xml:space="preserve">Такий запис практично неможливо візуально сприйняти, запам’ятати чи перевірити на помилки. Саме для вирішення цієї проблеми застосовуються системи числення, основи яких є степенями двійки:</w:t>
       </w:r>
-      <w:r>
-        <w:t xml:space="preserve"> </w:t>
-      </w:r>
-      <w:r>
-        <w:t xml:space="preserve">-</w:t>
-      </w:r>
-      <w:r>
-        <w:t xml:space="preserve"> </w:t>
-      </w:r>
+    </w:p>
+    <w:p>
+      <w:pPr>
+        <w:pStyle w:val="Compact"/>
+        <w:numPr>
+          <w:ilvl w:val="0"/>
+          <w:numId w:val="1012"/>
+        </w:numPr>
+      </w:pPr>
       <w:r>
         <w:rPr>
           <w:b/>
@@ -4491,15 +4552,15 @@
       <w:r>
         <w:t xml:space="preserve">.</w:t>
       </w:r>
-      <w:r>
-        <w:t xml:space="preserve"> </w:t>
-      </w:r>
-      <w:r>
-        <w:t xml:space="preserve">-</w:t>
-      </w:r>
-      <w:r>
-        <w:t xml:space="preserve"> </w:t>
-      </w:r>
+    </w:p>
+    <w:p>
+      <w:pPr>
+        <w:pStyle w:val="Compact"/>
+        <w:numPr>
+          <w:ilvl w:val="0"/>
+          <w:numId w:val="1012"/>
+        </w:numPr>
+      </w:pPr>
       <w:r>
         <w:rPr>
           <w:b/>
@@ -4554,11 +4615,11 @@
       <w:pPr>
         <w:pStyle w:val="Heading3"/>
       </w:pPr>
-      <w:bookmarkStart w:id="30" w:name="_59b8ee7950745e4f1a080c15d38ab05d67f2602"/>
+      <w:bookmarkStart w:id="31" w:name="_59b8ee7950745e4f1a080c15d38ab05d67f2602"/>
       <w:r>
         <w:t xml:space="preserve">Шістнадцяткова система числення</w:t>
       </w:r>
-      <w:bookmarkEnd w:id="30"/>
+      <w:bookmarkEnd w:id="31"/>
     </w:p>
     <w:p>
       <w:pPr>
@@ -4934,18 +4995,18 @@
       <w:pPr>
         <w:pStyle w:val="Heading3"/>
       </w:pPr>
-      <w:bookmarkStart w:id="31" w:name="_395700e033c780fa45acf7d2752116efd655afd"/>
+      <w:bookmarkStart w:id="32" w:name="_395700e033c780fa45acf7d2752116efd655afd"/>
       <w:r>
         <w:t xml:space="preserve">Основні сфери застосування шістнадцяткової системи:</w:t>
       </w:r>
-      <w:bookmarkEnd w:id="31"/>
+      <w:bookmarkEnd w:id="32"/>
     </w:p>
     <w:p>
       <w:pPr>
         <w:pStyle w:val="Compact"/>
         <w:numPr>
           <w:ilvl w:val="0"/>
-          <w:numId w:val="1007"/>
+          <w:numId w:val="1013"/>
         </w:numPr>
       </w:pPr>
       <w:r>
@@ -4979,7 +5040,7 @@
         <w:pStyle w:val="Compact"/>
         <w:numPr>
           <w:ilvl w:val="0"/>
-          <w:numId w:val="1007"/>
+          <w:numId w:val="1013"/>
         </w:numPr>
       </w:pPr>
       <w:r>
@@ -5151,7 +5212,7 @@
         <w:pStyle w:val="Compact"/>
         <w:numPr>
           <w:ilvl w:val="0"/>
-          <w:numId w:val="1007"/>
+          <w:numId w:val="1013"/>
         </w:numPr>
       </w:pPr>
       <w:r>
@@ -5173,7 +5234,7 @@
         <w:pStyle w:val="Compact"/>
         <w:numPr>
           <w:ilvl w:val="0"/>
-          <w:numId w:val="1007"/>
+          <w:numId w:val="1013"/>
         </w:numPr>
       </w:pPr>
       <w:r>
@@ -5219,31 +5280,31 @@
       <w:pPr>
         <w:pStyle w:val="Heading1"/>
       </w:pPr>
-      <w:bookmarkStart w:id="32" w:name="_3e197b264b7e6ea80f09ec766052c9ac4779224"/>
+      <w:bookmarkStart w:id="33" w:name="_3e197b264b7e6ea80f09ec766052c9ac4779224"/>
       <w:r>
         <w:t xml:space="preserve">РОЗДІЛ 3. АЛГОРИТМИ ПЕРЕВОДУ ЧИСЕЛ ТА ДВІЙКОВА АРИФМЕТИКА</w:t>
       </w:r>
-      <w:bookmarkEnd w:id="32"/>
+      <w:bookmarkEnd w:id="33"/>
     </w:p>
     <w:p>
       <w:pPr>
         <w:pStyle w:val="Heading2"/>
       </w:pPr>
-      <w:bookmarkStart w:id="33" w:name="_20a9249d2c12acb3305ef515a05358908aa0fbb"/>
+      <w:bookmarkStart w:id="34" w:name="_20a9249d2c12acb3305ef515a05358908aa0fbb"/>
       <w:r>
         <w:t xml:space="preserve">3.1. Переведення цілих та дробових чисел між десятковою та іншими системами. Нескінченні двійкові дроби та стандарт IEEE 754</w:t>
       </w:r>
-      <w:bookmarkEnd w:id="33"/>
+      <w:bookmarkEnd w:id="34"/>
     </w:p>
     <w:p>
       <w:pPr>
         <w:pStyle w:val="Heading3"/>
       </w:pPr>
-      <w:bookmarkStart w:id="34" w:name="_cfb4b8148b936431f8d2b4d5fea8b61708841d1"/>
+      <w:bookmarkStart w:id="35" w:name="_cfb4b8148b936431f8d2b4d5fea8b61708841d1"/>
       <w:r>
         <w:t xml:space="preserve">1. Переведення з довільної позиційної системи в десяткову</w:t>
       </w:r>
-      <w:bookmarkEnd w:id="34"/>
+      <w:bookmarkEnd w:id="35"/>
     </w:p>
     <w:p>
       <w:pPr>
@@ -5766,11 +5827,17 @@
       <w:r>
         <w:t xml:space="preserve">:</w:t>
       </w:r>
-      <w:r>
-        <w:t xml:space="preserve"> </w:t>
-      </w:r>
-      <w:r>
-        <w:t xml:space="preserve">- Крок 1:</w:t>
+    </w:p>
+    <w:p>
+      <w:pPr>
+        <w:pStyle w:val="Compact"/>
+        <w:numPr>
+          <w:ilvl w:val="0"/>
+          <w:numId w:val="1014"/>
+        </w:numPr>
+      </w:pPr>
+      <w:r>
+        <w:t xml:space="preserve">Крок 1:</w:t>
       </w:r>
       <w:r>
         <w:t xml:space="preserve"> </w:t>
@@ -5780,11 +5847,17 @@
           <m:t>1</m:t>
         </m:r>
       </m:oMath>
-      <w:r>
-        <w:t xml:space="preserve"> </w:t>
-      </w:r>
-      <w:r>
-        <w:t xml:space="preserve">- Крок 2:</w:t>
+    </w:p>
+    <w:p>
+      <w:pPr>
+        <w:pStyle w:val="Compact"/>
+        <w:numPr>
+          <w:ilvl w:val="0"/>
+          <w:numId w:val="1014"/>
+        </w:numPr>
+      </w:pPr>
+      <w:r>
+        <w:t xml:space="preserve">Крок 2:</w:t>
       </w:r>
       <w:r>
         <w:t xml:space="preserve"> </w:t>
@@ -5821,11 +5894,17 @@
           <m:t>3</m:t>
         </m:r>
       </m:oMath>
-      <w:r>
-        <w:t xml:space="preserve"> </w:t>
-      </w:r>
-      <w:r>
-        <w:t xml:space="preserve">- Крок 3:</w:t>
+    </w:p>
+    <w:p>
+      <w:pPr>
+        <w:pStyle w:val="Compact"/>
+        <w:numPr>
+          <w:ilvl w:val="0"/>
+          <w:numId w:val="1014"/>
+        </w:numPr>
+      </w:pPr>
+      <w:r>
+        <w:t xml:space="preserve">Крок 3:</w:t>
       </w:r>
       <w:r>
         <w:t xml:space="preserve"> </w:t>
@@ -5862,11 +5941,17 @@
           <m:t>6</m:t>
         </m:r>
       </m:oMath>
-      <w:r>
-        <w:t xml:space="preserve"> </w:t>
-      </w:r>
-      <w:r>
-        <w:t xml:space="preserve">- Крок 4:</w:t>
+    </w:p>
+    <w:p>
+      <w:pPr>
+        <w:pStyle w:val="Compact"/>
+        <w:numPr>
+          <w:ilvl w:val="0"/>
+          <w:numId w:val="1014"/>
+        </w:numPr>
+      </w:pPr>
+      <w:r>
+        <w:t xml:space="preserve">Крок 4:</w:t>
       </w:r>
       <w:r>
         <w:t xml:space="preserve"> </w:t>
@@ -5903,11 +5988,17 @@
           <m:t>13</m:t>
         </m:r>
       </m:oMath>
-      <w:r>
-        <w:t xml:space="preserve"> </w:t>
-      </w:r>
-      <w:r>
-        <w:t xml:space="preserve">- Крок 5:</w:t>
+    </w:p>
+    <w:p>
+      <w:pPr>
+        <w:pStyle w:val="Compact"/>
+        <w:numPr>
+          <w:ilvl w:val="0"/>
+          <w:numId w:val="1014"/>
+        </w:numPr>
+      </w:pPr>
+      <w:r>
+        <w:t xml:space="preserve">Крок 5:</w:t>
       </w:r>
       <w:r>
         <w:t xml:space="preserve"> </w:t>
@@ -5944,11 +6035,17 @@
           <m:t>26</m:t>
         </m:r>
       </m:oMath>
-      <w:r>
-        <w:t xml:space="preserve"> </w:t>
-      </w:r>
-      <w:r>
-        <w:t xml:space="preserve">- Крок 6:</w:t>
+    </w:p>
+    <w:p>
+      <w:pPr>
+        <w:pStyle w:val="Compact"/>
+        <w:numPr>
+          <w:ilvl w:val="0"/>
+          <w:numId w:val="1014"/>
+        </w:numPr>
+      </w:pPr>
+      <w:r>
+        <w:t xml:space="preserve">Крок 6:</w:t>
       </w:r>
       <w:r>
         <w:t xml:space="preserve"> </w:t>
@@ -6323,11 +6420,11 @@
       <w:pPr>
         <w:pStyle w:val="Heading3"/>
       </w:pPr>
-      <w:bookmarkStart w:id="35" w:name="_4abfaf841fb4eebf83d5dc324dc12704a22e155"/>
+      <w:bookmarkStart w:id="36" w:name="_4abfaf841fb4eebf83d5dc324dc12704a22e155"/>
       <w:r>
         <w:t xml:space="preserve">2. Переведення з десяткової системи в довільну позиційну</w:t>
       </w:r>
-      <w:bookmarkEnd w:id="35"/>
+      <w:bookmarkEnd w:id="36"/>
     </w:p>
     <w:p>
       <w:pPr>
@@ -6354,18 +6451,18 @@
       <w:pPr>
         <w:pStyle w:val="Heading4"/>
       </w:pPr>
-      <w:bookmarkStart w:id="36" w:name="_236a780e14936c554b4d264a71803c7c3e3b704"/>
+      <w:bookmarkStart w:id="37" w:name="_236a780e14936c554b4d264a71803c7c3e3b704"/>
       <w:r>
         <w:t xml:space="preserve">А. Алгоритм послідовного ділення для цілої частини:</w:t>
       </w:r>
-      <w:bookmarkEnd w:id="36"/>
+      <w:bookmarkEnd w:id="37"/>
     </w:p>
     <w:p>
       <w:pPr>
         <w:pStyle w:val="Compact"/>
         <w:numPr>
           <w:ilvl w:val="0"/>
-          <w:numId w:val="1008"/>
+          <w:numId w:val="1015"/>
         </w:numPr>
       </w:pPr>
       <w:r>
@@ -6388,7 +6485,7 @@
         <w:pStyle w:val="Compact"/>
         <w:numPr>
           <w:ilvl w:val="0"/>
-          <w:numId w:val="1008"/>
+          <w:numId w:val="1015"/>
         </w:numPr>
       </w:pPr>
       <w:r>
@@ -6426,7 +6523,7 @@
         <w:pStyle w:val="Compact"/>
         <w:numPr>
           <w:ilvl w:val="0"/>
-          <w:numId w:val="1008"/>
+          <w:numId w:val="1015"/>
         </w:numPr>
       </w:pPr>
       <w:r>
@@ -6449,7 +6546,7 @@
         <w:pStyle w:val="Compact"/>
         <w:numPr>
           <w:ilvl w:val="0"/>
-          <w:numId w:val="1008"/>
+          <w:numId w:val="1015"/>
         </w:numPr>
       </w:pPr>
       <w:r>
@@ -6472,7 +6569,7 @@
         <w:pStyle w:val="Compact"/>
         <w:numPr>
           <w:ilvl w:val="0"/>
-          <w:numId w:val="1008"/>
+          <w:numId w:val="1015"/>
         </w:numPr>
       </w:pPr>
       <w:r>
@@ -6523,15 +6620,15 @@
       <w:r>
         <w:t xml:space="preserve">у двійкову систему:</w:t>
       </w:r>
-      <w:r>
-        <w:t xml:space="preserve"> </w:t>
-      </w:r>
-      <w:r>
-        <w:t xml:space="preserve">-</w:t>
-      </w:r>
-      <w:r>
-        <w:t xml:space="preserve"> </w:t>
-      </w:r>
+    </w:p>
+    <w:p>
+      <w:pPr>
+        <w:pStyle w:val="Compact"/>
+        <w:numPr>
+          <w:ilvl w:val="0"/>
+          <w:numId w:val="1016"/>
+        </w:numPr>
+      </w:pPr>
       <m:oMath>
         <m:r>
           <m:t>157</m:t>
@@ -6575,15 +6672,15 @@
       <w:r>
         <w:t xml:space="preserve">— молодший біт LSB)</w:t>
       </w:r>
-      <w:r>
-        <w:t xml:space="preserve"> </w:t>
-      </w:r>
-      <w:r>
-        <w:t xml:space="preserve">-</w:t>
-      </w:r>
-      <w:r>
-        <w:t xml:space="preserve"> </w:t>
-      </w:r>
+    </w:p>
+    <w:p>
+      <w:pPr>
+        <w:pStyle w:val="Compact"/>
+        <w:numPr>
+          <w:ilvl w:val="0"/>
+          <w:numId w:val="1016"/>
+        </w:numPr>
+      </w:pPr>
       <m:oMath>
         <m:r>
           <m:t>78</m:t>
@@ -6624,15 +6721,15 @@
       <w:r>
         <w:t xml:space="preserve">)</w:t>
       </w:r>
-      <w:r>
-        <w:t xml:space="preserve"> </w:t>
-      </w:r>
-      <w:r>
-        <w:t xml:space="preserve">-</w:t>
-      </w:r>
-      <w:r>
-        <w:t xml:space="preserve"> </w:t>
-      </w:r>
+    </w:p>
+    <w:p>
+      <w:pPr>
+        <w:pStyle w:val="Compact"/>
+        <w:numPr>
+          <w:ilvl w:val="0"/>
+          <w:numId w:val="1016"/>
+        </w:numPr>
+      </w:pPr>
       <m:oMath>
         <m:r>
           <m:t>39</m:t>
@@ -6673,15 +6770,15 @@
       <w:r>
         <w:t xml:space="preserve">)</w:t>
       </w:r>
-      <w:r>
-        <w:t xml:space="preserve"> </w:t>
-      </w:r>
-      <w:r>
-        <w:t xml:space="preserve">-</w:t>
-      </w:r>
-      <w:r>
-        <w:t xml:space="preserve"> </w:t>
-      </w:r>
+    </w:p>
+    <w:p>
+      <w:pPr>
+        <w:pStyle w:val="Compact"/>
+        <w:numPr>
+          <w:ilvl w:val="0"/>
+          <w:numId w:val="1016"/>
+        </w:numPr>
+      </w:pPr>
       <m:oMath>
         <m:r>
           <m:t>19</m:t>
@@ -6722,15 +6819,15 @@
       <w:r>
         <w:t xml:space="preserve">)</w:t>
       </w:r>
-      <w:r>
-        <w:t xml:space="preserve"> </w:t>
-      </w:r>
-      <w:r>
-        <w:t xml:space="preserve">-</w:t>
-      </w:r>
-      <w:r>
-        <w:t xml:space="preserve"> </w:t>
-      </w:r>
+    </w:p>
+    <w:p>
+      <w:pPr>
+        <w:pStyle w:val="Compact"/>
+        <w:numPr>
+          <w:ilvl w:val="0"/>
+          <w:numId w:val="1016"/>
+        </w:numPr>
+      </w:pPr>
       <m:oMath>
         <m:r>
           <m:t>9</m:t>
@@ -6771,15 +6868,15 @@
       <w:r>
         <w:t xml:space="preserve">)</w:t>
       </w:r>
-      <w:r>
-        <w:t xml:space="preserve"> </w:t>
-      </w:r>
-      <w:r>
-        <w:t xml:space="preserve">-</w:t>
-      </w:r>
-      <w:r>
-        <w:t xml:space="preserve"> </w:t>
-      </w:r>
+    </w:p>
+    <w:p>
+      <w:pPr>
+        <w:pStyle w:val="Compact"/>
+        <w:numPr>
+          <w:ilvl w:val="0"/>
+          <w:numId w:val="1016"/>
+        </w:numPr>
+      </w:pPr>
       <m:oMath>
         <m:r>
           <m:t>4</m:t>
@@ -6820,15 +6917,15 @@
       <w:r>
         <w:t xml:space="preserve">)</w:t>
       </w:r>
-      <w:r>
-        <w:t xml:space="preserve"> </w:t>
-      </w:r>
-      <w:r>
-        <w:t xml:space="preserve">-</w:t>
-      </w:r>
-      <w:r>
-        <w:t xml:space="preserve"> </w:t>
-      </w:r>
+    </w:p>
+    <w:p>
+      <w:pPr>
+        <w:pStyle w:val="Compact"/>
+        <w:numPr>
+          <w:ilvl w:val="0"/>
+          <w:numId w:val="1016"/>
+        </w:numPr>
+      </w:pPr>
       <m:oMath>
         <m:r>
           <m:t>2</m:t>
@@ -6869,15 +6966,15 @@
       <w:r>
         <w:t xml:space="preserve">)</w:t>
       </w:r>
-      <w:r>
-        <w:t xml:space="preserve"> </w:t>
-      </w:r>
-      <w:r>
-        <w:t xml:space="preserve">-</w:t>
-      </w:r>
-      <w:r>
-        <w:t xml:space="preserve"> </w:t>
-      </w:r>
+    </w:p>
+    <w:p>
+      <w:pPr>
+        <w:pStyle w:val="Compact"/>
+        <w:numPr>
+          <w:ilvl w:val="0"/>
+          <w:numId w:val="1016"/>
+        </w:numPr>
+      </w:pPr>
       <m:oMath>
         <m:r>
           <m:t>1</m:t>
@@ -6924,7 +7021,7 @@
     </w:p>
     <w:p>
       <w:pPr>
-        <w:pStyle w:val="BodyText"/>
+        <w:pStyle w:val="FirstParagraph"/>
       </w:pPr>
       <w:r>
         <w:t xml:space="preserve">Виписуємо залишки від низу до верху:</w:t>
@@ -6972,18 +7069,18 @@
       <w:pPr>
         <w:pStyle w:val="Heading4"/>
       </w:pPr>
-      <w:bookmarkStart w:id="37" w:name="_b8e6b93bf4238205d596ee4659cd3f0b2b1797e"/>
+      <w:bookmarkStart w:id="38" w:name="_b8e6b93bf4238205d596ee4659cd3f0b2b1797e"/>
       <w:r>
         <w:t xml:space="preserve">Б. Алгоритм послідовного множення для правильного дробу:</w:t>
       </w:r>
-      <w:bookmarkEnd w:id="37"/>
+      <w:bookmarkEnd w:id="38"/>
     </w:p>
     <w:p>
       <w:pPr>
         <w:pStyle w:val="Compact"/>
         <w:numPr>
           <w:ilvl w:val="0"/>
-          <w:numId w:val="1009"/>
+          <w:numId w:val="1017"/>
         </w:numPr>
       </w:pPr>
       <w:r>
@@ -7006,7 +7103,7 @@
         <w:pStyle w:val="Compact"/>
         <w:numPr>
           <w:ilvl w:val="0"/>
-          <w:numId w:val="1009"/>
+          <w:numId w:val="1017"/>
         </w:numPr>
       </w:pPr>
       <w:r>
@@ -7018,7 +7115,7 @@
         <w:pStyle w:val="Compact"/>
         <w:numPr>
           <w:ilvl w:val="0"/>
-          <w:numId w:val="1009"/>
+          <w:numId w:val="1017"/>
         </w:numPr>
       </w:pPr>
       <w:r>
@@ -7041,7 +7138,7 @@
         <w:pStyle w:val="Compact"/>
         <w:numPr>
           <w:ilvl w:val="0"/>
-          <w:numId w:val="1009"/>
+          <w:numId w:val="1017"/>
         </w:numPr>
       </w:pPr>
       <w:r>
@@ -7053,7 +7150,7 @@
         <w:pStyle w:val="Compact"/>
         <w:numPr>
           <w:ilvl w:val="0"/>
-          <w:numId w:val="1009"/>
+          <w:numId w:val="1017"/>
         </w:numPr>
       </w:pPr>
       <w:r>
@@ -7113,15 +7210,15 @@
       <w:r>
         <w:t xml:space="preserve">у двійкову систему:</w:t>
       </w:r>
-      <w:r>
-        <w:t xml:space="preserve"> </w:t>
-      </w:r>
-      <w:r>
-        <w:t xml:space="preserve">-</w:t>
-      </w:r>
-      <w:r>
-        <w:t xml:space="preserve"> </w:t>
-      </w:r>
+    </w:p>
+    <w:p>
+      <w:pPr>
+        <w:pStyle w:val="Compact"/>
+        <w:numPr>
+          <w:ilvl w:val="0"/>
+          <w:numId w:val="1018"/>
+        </w:numPr>
+      </w:pPr>
       <m:oMath>
         <m:r>
           <m:t>0</m:t>
@@ -7206,15 +7303,15 @@
           <m:t>25</m:t>
         </m:r>
       </m:oMath>
-      <w:r>
-        <w:t xml:space="preserve"> </w:t>
-      </w:r>
-      <w:r>
-        <w:t xml:space="preserve">-</w:t>
-      </w:r>
-      <w:r>
-        <w:t xml:space="preserve"> </w:t>
-      </w:r>
+    </w:p>
+    <w:p>
+      <w:pPr>
+        <w:pStyle w:val="Compact"/>
+        <w:numPr>
+          <w:ilvl w:val="0"/>
+          <w:numId w:val="1018"/>
+        </w:numPr>
+      </w:pPr>
       <m:oMath>
         <m:r>
           <m:t>0</m:t>
@@ -7299,15 +7396,15 @@
           <m:t>50</m:t>
         </m:r>
       </m:oMath>
-      <w:r>
-        <w:t xml:space="preserve"> </w:t>
-      </w:r>
-      <w:r>
-        <w:t xml:space="preserve">-</w:t>
-      </w:r>
-      <w:r>
-        <w:t xml:space="preserve"> </w:t>
-      </w:r>
+    </w:p>
+    <w:p>
+      <w:pPr>
+        <w:pStyle w:val="Compact"/>
+        <w:numPr>
+          <w:ilvl w:val="0"/>
+          <w:numId w:val="1018"/>
+        </w:numPr>
+      </w:pPr>
       <m:oMath>
         <m:r>
           <m:t>0</m:t>
@@ -7533,11 +7630,11 @@
       <w:pPr>
         <w:pStyle w:val="Heading4"/>
       </w:pPr>
-      <w:bookmarkStart w:id="38" w:name="_d68a2f4e82cb254611bdbd0ea2529541f43aa1c"/>
+      <w:bookmarkStart w:id="39" w:name="_d68a2f4e82cb254611bdbd0ea2529541f43aa1c"/>
       <w:r>
         <w:t xml:space="preserve">В. Нескінченні періодичні двійкові дроби та похибки обчислень (стандарт IEEE 754)</w:t>
       </w:r>
-      <w:bookmarkEnd w:id="38"/>
+      <w:bookmarkEnd w:id="39"/>
     </w:p>
     <w:p>
       <w:pPr>
@@ -8002,15 +8099,15 @@
         </w:rPr>
         <w:t xml:space="preserve">у двійкову форму):</w:t>
       </w:r>
-      <w:r>
-        <w:t xml:space="preserve"> </w:t>
-      </w:r>
-      <w:r>
-        <w:t xml:space="preserve">-</w:t>
-      </w:r>
-      <w:r>
-        <w:t xml:space="preserve"> </w:t>
-      </w:r>
+    </w:p>
+    <w:p>
+      <w:pPr>
+        <w:pStyle w:val="Compact"/>
+        <w:numPr>
+          <w:ilvl w:val="0"/>
+          <w:numId w:val="1019"/>
+        </w:numPr>
+      </w:pPr>
       <m:oMath>
         <m:r>
           <m:t>0</m:t>
@@ -8065,14 +8162,17 @@
         </m:r>
       </m:oMath>
       <w:r>
-        <w:t xml:space="preserve"> </w:t>
-      </w:r>
-      <w:r>
-        <w:t xml:space="preserve">-</w:t>
-      </w:r>
-      <w:r>
-        <w:t xml:space="preserve"> </w:t>
-      </w:r>
+        <w:t xml:space="preserve">​</w:t>
+      </w:r>
+    </w:p>
+    <w:p>
+      <w:pPr>
+        <w:pStyle w:val="Compact"/>
+        <w:numPr>
+          <w:ilvl w:val="0"/>
+          <w:numId w:val="1019"/>
+        </w:numPr>
+      </w:pPr>
       <m:oMath>
         <m:r>
           <m:t>0</m:t>
@@ -8127,14 +8227,17 @@
         </m:r>
       </m:oMath>
       <w:r>
-        <w:t xml:space="preserve"> </w:t>
-      </w:r>
-      <w:r>
-        <w:t xml:space="preserve">-</w:t>
-      </w:r>
-      <w:r>
-        <w:t xml:space="preserve"> </w:t>
-      </w:r>
+        <w:t xml:space="preserve">​</w:t>
+      </w:r>
+    </w:p>
+    <w:p>
+      <w:pPr>
+        <w:pStyle w:val="Compact"/>
+        <w:numPr>
+          <w:ilvl w:val="0"/>
+          <w:numId w:val="1019"/>
+        </w:numPr>
+      </w:pPr>
       <m:oMath>
         <m:r>
           <m:t>0</m:t>
@@ -8189,14 +8292,17 @@
         </m:r>
       </m:oMath>
       <w:r>
-        <w:t xml:space="preserve"> </w:t>
-      </w:r>
-      <w:r>
-        <w:t xml:space="preserve">-</w:t>
-      </w:r>
-      <w:r>
-        <w:t xml:space="preserve"> </w:t>
-      </w:r>
+        <w:t xml:space="preserve">​</w:t>
+      </w:r>
+    </w:p>
+    <w:p>
+      <w:pPr>
+        <w:pStyle w:val="Compact"/>
+        <w:numPr>
+          <w:ilvl w:val="0"/>
+          <w:numId w:val="1019"/>
+        </w:numPr>
+      </w:pPr>
       <m:oMath>
         <m:r>
           <m:t>0</m:t>
@@ -8251,14 +8357,17 @@
         </m:r>
       </m:oMath>
       <w:r>
-        <w:t xml:space="preserve"> </w:t>
-      </w:r>
-      <w:r>
-        <w:t xml:space="preserve">-</w:t>
-      </w:r>
-      <w:r>
-        <w:t xml:space="preserve"> </w:t>
-      </w:r>
+        <w:t xml:space="preserve">​</w:t>
+      </w:r>
+    </w:p>
+    <w:p>
+      <w:pPr>
+        <w:pStyle w:val="Compact"/>
+        <w:numPr>
+          <w:ilvl w:val="0"/>
+          <w:numId w:val="1019"/>
+        </w:numPr>
+      </w:pPr>
       <m:oMath>
         <m:r>
           <m:t>0</m:t>
@@ -8313,14 +8422,17 @@
         </m:r>
       </m:oMath>
       <w:r>
-        <w:t xml:space="preserve"> </w:t>
-      </w:r>
-      <w:r>
-        <w:t xml:space="preserve">-</w:t>
-      </w:r>
-      <w:r>
-        <w:t xml:space="preserve"> </w:t>
-      </w:r>
+        <w:t xml:space="preserve">​</w:t>
+      </w:r>
+    </w:p>
+    <w:p>
+      <w:pPr>
+        <w:pStyle w:val="Compact"/>
+        <w:numPr>
+          <w:ilvl w:val="0"/>
+          <w:numId w:val="1019"/>
+        </w:numPr>
+      </w:pPr>
       <m:oMath>
         <m:r>
           <m:t>0</m:t>
@@ -8801,11 +8913,17 @@
       <w:r>
         <w:t xml:space="preserve">де розрядна сітка має суворо фіксовану довжину:</w:t>
       </w:r>
-      <w:r>
-        <w:t xml:space="preserve"> </w:t>
-      </w:r>
-      <w:r>
-        <w:t xml:space="preserve">- для формату одинарної точності (32 біти, тип</w:t>
+    </w:p>
+    <w:p>
+      <w:pPr>
+        <w:pStyle w:val="Compact"/>
+        <w:numPr>
+          <w:ilvl w:val="0"/>
+          <w:numId w:val="1020"/>
+        </w:numPr>
+      </w:pPr>
+      <w:r>
+        <w:t xml:space="preserve">для формату одинарної точності (32 біти, тип</w:t>
       </w:r>
       <w:r>
         <w:t xml:space="preserve"> </w:t>
@@ -8819,11 +8937,17 @@
       <w:r>
         <w:t xml:space="preserve">) під мантису відведено 23 біти;</w:t>
       </w:r>
-      <w:r>
-        <w:t xml:space="preserve"> </w:t>
-      </w:r>
-      <w:r>
-        <w:t xml:space="preserve">- для формату подвійної точності (64 біти, тип</w:t>
+    </w:p>
+    <w:p>
+      <w:pPr>
+        <w:pStyle w:val="Compact"/>
+        <w:numPr>
+          <w:ilvl w:val="0"/>
+          <w:numId w:val="1020"/>
+        </w:numPr>
+      </w:pPr>
+      <w:r>
+        <w:t xml:space="preserve">для формату подвійної точності (64 біти, тип</w:t>
       </w:r>
       <w:r>
         <w:t xml:space="preserve"> </w:t>
@@ -9133,7 +9257,7 @@
       <w:pPr>
         <w:pStyle w:val="Heading2"/>
       </w:pPr>
-      <w:bookmarkStart w:id="39" w:name="_18c54411102c17845bb46537abdad4d5c0e460e"/>
+      <w:bookmarkStart w:id="40" w:name="_18c54411102c17845bb46537abdad4d5c0e460e"/>
       <w:r>
         <w:t xml:space="preserve">3.2. Швидкий перехід між системами з основами</w:t>
       </w:r>
@@ -9169,7 +9293,7 @@
       <w:r>
         <w:t xml:space="preserve">(метод тріад і тетрад)</w:t>
       </w:r>
-      <w:bookmarkEnd w:id="39"/>
+      <w:bookmarkEnd w:id="40"/>
     </w:p>
     <w:p>
       <w:pPr>
@@ -9280,18 +9404,18 @@
       <w:pPr>
         <w:pStyle w:val="Heading3"/>
       </w:pPr>
-      <w:bookmarkStart w:id="40" w:name="_182d00d717dc8ea218208396a8f567c56e99681"/>
+      <w:bookmarkStart w:id="41" w:name="_182d00d717dc8ea218208396a8f567c56e99681"/>
       <w:r>
         <w:t xml:space="preserve">Правило переведення з двійкової системи у шістнадцяткову:</w:t>
       </w:r>
-      <w:bookmarkEnd w:id="40"/>
+      <w:bookmarkEnd w:id="41"/>
     </w:p>
     <w:p>
       <w:pPr>
         <w:pStyle w:val="Compact"/>
         <w:numPr>
           <w:ilvl w:val="0"/>
-          <w:numId w:val="1010"/>
+          <w:numId w:val="1021"/>
         </w:numPr>
       </w:pPr>
       <w:r>
@@ -9316,7 +9440,7 @@
         <w:pStyle w:val="Compact"/>
         <w:numPr>
           <w:ilvl w:val="1"/>
-          <w:numId w:val="1011"/>
+          <w:numId w:val="1022"/>
         </w:numPr>
       </w:pPr>
       <w:r>
@@ -9341,7 +9465,7 @@
         <w:pStyle w:val="Compact"/>
         <w:numPr>
           <w:ilvl w:val="1"/>
-          <w:numId w:val="1011"/>
+          <w:numId w:val="1022"/>
         </w:numPr>
       </w:pPr>
       <w:r>
@@ -9366,7 +9490,7 @@
         <w:pStyle w:val="Compact"/>
         <w:numPr>
           <w:ilvl w:val="0"/>
-          <w:numId w:val="1010"/>
+          <w:numId w:val="1021"/>
         </w:numPr>
       </w:pPr>
       <w:r>
@@ -9378,7 +9502,7 @@
         <w:pStyle w:val="Compact"/>
         <w:numPr>
           <w:ilvl w:val="0"/>
-          <w:numId w:val="1010"/>
+          <w:numId w:val="1021"/>
         </w:numPr>
       </w:pPr>
       <w:r>
@@ -9434,11 +9558,17 @@
       <w:r>
         <w:t xml:space="preserve">у шістнадцяткову форму:</w:t>
       </w:r>
-      <w:r>
-        <w:t xml:space="preserve"> </w:t>
-      </w:r>
-      <w:r>
-        <w:t xml:space="preserve">- Розбиваємо цілу частину вліво:</w:t>
+    </w:p>
+    <w:p>
+      <w:pPr>
+        <w:pStyle w:val="Compact"/>
+        <w:numPr>
+          <w:ilvl w:val="0"/>
+          <w:numId w:val="1023"/>
+        </w:numPr>
+      </w:pPr>
+      <w:r>
+        <w:t xml:space="preserve">Розбиваємо цілу частину вліво:</w:t>
       </w:r>
       <w:r>
         <w:t xml:space="preserve"> </w:t>
@@ -9502,11 +9632,17 @@
       <w:r>
         <w:t xml:space="preserve">.</w:t>
       </w:r>
-      <w:r>
-        <w:t xml:space="preserve"> </w:t>
-      </w:r>
-      <w:r>
-        <w:t xml:space="preserve">- Розбиваємо дробову частину вправо:</w:t>
+    </w:p>
+    <w:p>
+      <w:pPr>
+        <w:pStyle w:val="Compact"/>
+        <w:numPr>
+          <w:ilvl w:val="0"/>
+          <w:numId w:val="1023"/>
+        </w:numPr>
+      </w:pPr>
+      <w:r>
+        <w:t xml:space="preserve">Розбиваємо дробову частину вправо:</w:t>
       </w:r>
       <w:r>
         <w:t xml:space="preserve"> </w:t>
@@ -9558,16 +9694,22 @@
       <w:r>
         <w:t xml:space="preserve">.</w:t>
       </w:r>
-      <w:r>
-        <w:t xml:space="preserve"> </w:t>
-      </w:r>
-      <w:r>
-        <w:t xml:space="preserve">- Маємо розбивку:</w:t>
-      </w:r>
-    </w:p>
-    <w:p>
-      <w:pPr>
-        <w:pStyle w:val="BodyText"/>
+    </w:p>
+    <w:p>
+      <w:pPr>
+        <w:pStyle w:val="Compact"/>
+        <w:numPr>
+          <w:ilvl w:val="0"/>
+          <w:numId w:val="1023"/>
+        </w:numPr>
+      </w:pPr>
+      <w:r>
+        <w:t xml:space="preserve">Маємо розбивку:</w:t>
+      </w:r>
+    </w:p>
+    <w:p>
+      <w:pPr>
+        <w:pStyle w:val="Compact"/>
       </w:pPr>
       <m:oMathPara>
         <m:oMathParaPr>
@@ -9828,31 +9970,31 @@
       <w:pPr>
         <w:pStyle w:val="Heading2"/>
       </w:pPr>
-      <w:bookmarkStart w:id="41" w:name="_d14045658058845f4b4452b0291777117992e8e"/>
+      <w:bookmarkStart w:id="42" w:name="_d14045658058845f4b4452b0291777117992e8e"/>
       <w:r>
         <w:t xml:space="preserve">3.3. Арифметичні операції у двійковій системі та машинне кодування чисел (прямий, обернений, додатковий коди)</w:t>
       </w:r>
-      <w:bookmarkEnd w:id="41"/>
+      <w:bookmarkEnd w:id="42"/>
     </w:p>
     <w:p>
       <w:pPr>
         <w:pStyle w:val="Heading3"/>
       </w:pPr>
-      <w:bookmarkStart w:id="42" w:name="_e225b9cccc2a69d5327af932ed1c3dd94f4d4c2"/>
+      <w:bookmarkStart w:id="43" w:name="_e225b9cccc2a69d5327af932ed1c3dd94f4d4c2"/>
       <w:r>
         <w:t xml:space="preserve">1. Двійкове додавання та множення у стовпчик</w:t>
       </w:r>
-      <w:bookmarkEnd w:id="42"/>
+      <w:bookmarkEnd w:id="43"/>
     </w:p>
     <w:p>
       <w:pPr>
         <w:pStyle w:val="Heading4"/>
       </w:pPr>
-      <w:bookmarkStart w:id="43" w:name="_b38d680b66ac07d6ea5198678e92a66f32c65d3"/>
+      <w:bookmarkStart w:id="44" w:name="_b38d680b66ac07d6ea5198678e92a66f32c65d3"/>
       <w:r>
         <w:t xml:space="preserve">А. Додавання у стовпчик</w:t>
       </w:r>
-      <w:bookmarkEnd w:id="43"/>
+      <w:bookmarkEnd w:id="44"/>
     </w:p>
     <w:p>
       <w:pPr>
@@ -10126,11 +10268,11 @@
       <w:pPr>
         <w:pStyle w:val="Heading4"/>
       </w:pPr>
-      <w:bookmarkStart w:id="44" w:name="_d01a7821dbe08f2f2a6aa70083b79f0d47d00cb"/>
+      <w:bookmarkStart w:id="45" w:name="_d01a7821dbe08f2f2a6aa70083b79f0d47d00cb"/>
       <w:r>
         <w:t xml:space="preserve">Б. Множення у стовпчик</w:t>
       </w:r>
-      <w:bookmarkEnd w:id="44"/>
+      <w:bookmarkEnd w:id="45"/>
     </w:p>
     <w:p>
       <w:pPr>
@@ -10515,11 +10657,11 @@
       <w:pPr>
         <w:pStyle w:val="Heading3"/>
       </w:pPr>
-      <w:bookmarkStart w:id="45" w:name="_e34edbe042a513ee695b7903d72e91c3ae23f0c"/>
+      <w:bookmarkStart w:id="46" w:name="_e34edbe042a513ee695b7903d72e91c3ae23f0c"/>
       <w:r>
         <w:t xml:space="preserve">2. Машинне представлення чисел зі знаком у розрядній сітці ЕОМ</w:t>
       </w:r>
-      <w:bookmarkEnd w:id="45"/>
+      <w:bookmarkEnd w:id="46"/>
     </w:p>
     <w:p>
       <w:pPr>
@@ -10541,15 +10683,15 @@
       <w:r>
         <w:t xml:space="preserve">:</w:t>
       </w:r>
-      <w:r>
-        <w:t xml:space="preserve"> </w:t>
-      </w:r>
-      <w:r>
-        <w:t xml:space="preserve">-</w:t>
-      </w:r>
-      <w:r>
-        <w:t xml:space="preserve"> </w:t>
-      </w:r>
+    </w:p>
+    <w:p>
+      <w:pPr>
+        <w:pStyle w:val="Compact"/>
+        <w:numPr>
+          <w:ilvl w:val="0"/>
+          <w:numId w:val="1024"/>
+        </w:numPr>
+      </w:pPr>
       <m:oMath>
         <m:r>
           <m:rPr>
@@ -10579,15 +10721,15 @@
       <w:r>
         <w:t xml:space="preserve">число додатне;</w:t>
       </w:r>
-      <w:r>
-        <w:t xml:space="preserve"> </w:t>
-      </w:r>
-      <w:r>
-        <w:t xml:space="preserve">-</w:t>
-      </w:r>
-      <w:r>
-        <w:t xml:space="preserve"> </w:t>
-      </w:r>
+    </w:p>
+    <w:p>
+      <w:pPr>
+        <w:pStyle w:val="Compact"/>
+        <w:numPr>
+          <w:ilvl w:val="0"/>
+          <w:numId w:val="1024"/>
+        </w:numPr>
+      </w:pPr>
       <m:oMath>
         <m:r>
           <m:rPr>
@@ -10620,7 +10762,7 @@
     </w:p>
     <w:p>
       <w:pPr>
-        <w:pStyle w:val="BodyText"/>
+        <w:pStyle w:val="FirstParagraph"/>
       </w:pPr>
       <w:r>
         <w:t xml:space="preserve">В історії розвитку обчислювальної техніки застосовувалися три формати кодування цілих чисел зі знаком.</w:t>
@@ -10630,11 +10772,11 @@
       <w:pPr>
         <w:pStyle w:val="Heading4"/>
       </w:pPr>
-      <w:bookmarkStart w:id="46" w:name="_3da8a68b7e4480f667ecdefa8f76e1d410b1ee7"/>
+      <w:bookmarkStart w:id="47" w:name="_3da8a68b7e4480f667ecdefa8f76e1d410b1ee7"/>
       <w:r>
         <w:t xml:space="preserve">А. Прямий код (Sign and Magnitude / Direct Code)</w:t>
       </w:r>
-      <w:bookmarkEnd w:id="46"/>
+      <w:bookmarkEnd w:id="47"/>
     </w:p>
     <w:p>
       <w:pPr>
@@ -10666,11 +10808,17 @@
       <w:r>
         <w:t xml:space="preserve">молодших розрядах розміщується двійковий модуль числа:</w:t>
       </w:r>
-      <w:r>
-        <w:t xml:space="preserve"> </w:t>
-      </w:r>
-      <w:r>
-        <w:t xml:space="preserve">- для додатного числа:</w:t>
+    </w:p>
+    <w:p>
+      <w:pPr>
+        <w:pStyle w:val="Compact"/>
+        <w:numPr>
+          <w:ilvl w:val="0"/>
+          <w:numId w:val="1025"/>
+        </w:numPr>
+      </w:pPr>
+      <w:r>
+        <w:t xml:space="preserve">для додатного числа:</w:t>
       </w:r>
       <w:r>
         <w:t xml:space="preserve"> </w:t>
@@ -10773,11 +10921,17 @@
       <w:r>
         <w:t xml:space="preserve">;</w:t>
       </w:r>
-      <w:r>
-        <w:t xml:space="preserve"> </w:t>
-      </w:r>
-      <w:r>
-        <w:t xml:space="preserve">- для від’ємного числа:</w:t>
+    </w:p>
+    <w:p>
+      <w:pPr>
+        <w:pStyle w:val="Compact"/>
+        <w:numPr>
+          <w:ilvl w:val="0"/>
+          <w:numId w:val="1025"/>
+        </w:numPr>
+      </w:pPr>
+      <w:r>
+        <w:t xml:space="preserve">для від’ємного числа:</w:t>
       </w:r>
       <w:r>
         <w:t xml:space="preserve"> </w:t>
@@ -11035,15 +11189,15 @@
         </w:rPr>
         <w:t xml:space="preserve">Причини відмови від прямого коду:</w:t>
       </w:r>
-      <w:r>
-        <w:t xml:space="preserve"> </w:t>
-      </w:r>
-      <w:r>
-        <w:t xml:space="preserve">1.</w:t>
-      </w:r>
-      <w:r>
-        <w:t xml:space="preserve"> </w:t>
-      </w:r>
+    </w:p>
+    <w:p>
+      <w:pPr>
+        <w:pStyle w:val="Compact"/>
+        <w:numPr>
+          <w:ilvl w:val="0"/>
+          <w:numId w:val="1026"/>
+        </w:numPr>
+      </w:pPr>
       <w:r>
         <w:rPr>
           <w:b/>
@@ -11130,15 +11284,15 @@
       <w:r>
         <w:t xml:space="preserve">. Це змушувало апаратуру виконувати зайві перевірки при кожному логічному порівнянні з нулем.</w:t>
       </w:r>
-      <w:r>
-        <w:t xml:space="preserve"> </w:t>
-      </w:r>
-      <w:r>
-        <w:t xml:space="preserve">2.</w:t>
-      </w:r>
-      <w:r>
-        <w:t xml:space="preserve"> </w:t>
-      </w:r>
+    </w:p>
+    <w:p>
+      <w:pPr>
+        <w:pStyle w:val="Compact"/>
+        <w:numPr>
+          <w:ilvl w:val="0"/>
+          <w:numId w:val="1026"/>
+        </w:numPr>
+      </w:pPr>
       <w:r>
         <w:rPr>
           <w:b/>
@@ -11155,7 +11309,7 @@
     </w:p>
     <w:p>
       <w:pPr>
-        <w:pStyle w:val="BodyText"/>
+        <w:pStyle w:val="Compact"/>
       </w:pPr>
       <m:oMathPara>
         <m:oMathParaPr>
@@ -11326,7 +11480,8 @@
     </w:p>
     <w:p>
       <w:pPr>
-        <w:pStyle w:val="FirstParagraph"/>
+        <w:pStyle w:val="Compact"/>
+        <w:ind w:left="720" w:firstLine="0"/>
       </w:pPr>
       <w:r>
         <w:t xml:space="preserve">Для реалізації віднімання вимагалося конструювати окремий складний апаратний віднімач, що значно збільшувало кількість транзисторів і площу кристала.</w:t>
@@ -11336,11 +11491,11 @@
       <w:pPr>
         <w:pStyle w:val="Heading4"/>
       </w:pPr>
-      <w:bookmarkStart w:id="47" w:name="_ad8d7d020ca87c6c2ac9a2d3742339bda67172d"/>
+      <w:bookmarkStart w:id="48" w:name="_ad8d7d020ca87c6c2ac9a2d3742339bda67172d"/>
       <w:r>
         <w:t xml:space="preserve">Б. Обернений код (Ones’ Complement / Inverse Code)</w:t>
       </w:r>
-      <w:bookmarkEnd w:id="47"/>
+      <w:bookmarkEnd w:id="48"/>
     </w:p>
     <w:p>
       <w:pPr>
@@ -11571,11 +11726,17 @@
         </w:rPr>
         <w:t xml:space="preserve">Недоліки оберненого коду:</w:t>
       </w:r>
-      <w:r>
-        <w:t xml:space="preserve"> </w:t>
-      </w:r>
-      <w:r>
-        <w:t xml:space="preserve">1. Проблема двох нулів залишилася нерозв’язаною:</w:t>
+    </w:p>
+    <w:p>
+      <w:pPr>
+        <w:pStyle w:val="Compact"/>
+        <w:numPr>
+          <w:ilvl w:val="0"/>
+          <w:numId w:val="1027"/>
+        </w:numPr>
+      </w:pPr>
+      <w:r>
+        <w:t xml:space="preserve">Проблема двох нулів залишилася нерозв’язаною:</w:t>
       </w:r>
       <w:r>
         <w:t xml:space="preserve"> </w:t>
@@ -11650,11 +11811,17 @@
       <w:r>
         <w:t xml:space="preserve">.</w:t>
       </w:r>
-      <w:r>
-        <w:t xml:space="preserve"> </w:t>
-      </w:r>
-      <w:r>
-        <w:t xml:space="preserve">2. При виконанні арифметичних операцій виникає явище</w:t>
+    </w:p>
+    <w:p>
+      <w:pPr>
+        <w:pStyle w:val="Compact"/>
+        <w:numPr>
+          <w:ilvl w:val="0"/>
+          <w:numId w:val="1027"/>
+        </w:numPr>
+      </w:pPr>
+      <w:r>
+        <w:t xml:space="preserve">При виконанні арифметичних операцій виникає явище</w:t>
       </w:r>
       <w:r>
         <w:t xml:space="preserve"> </w:t>
@@ -11674,11 +11841,11 @@
       <w:pPr>
         <w:pStyle w:val="Heading4"/>
       </w:pPr>
-      <w:bookmarkStart w:id="48" w:name="_2af9bbdbb8756cef6ca669deddb8c996a82f2db"/>
+      <w:bookmarkStart w:id="49" w:name="_2af9bbdbb8756cef6ca669deddb8c996a82f2db"/>
       <w:r>
         <w:t xml:space="preserve">В. Додатковий код (Two’s Complement) — сучасний інженерний стандарт</w:t>
       </w:r>
-      <w:bookmarkEnd w:id="48"/>
+      <w:bookmarkEnd w:id="49"/>
     </w:p>
     <w:p>
       <w:pPr>
@@ -11900,11 +12067,17 @@
       <w:r>
         <w:t xml:space="preserve">у 8-бітному додатковому коді:</w:t>
       </w:r>
-      <w:r>
-        <w:t xml:space="preserve"> </w:t>
-      </w:r>
-      <w:r>
-        <w:t xml:space="preserve">1. Записуємо</w:t>
+    </w:p>
+    <w:p>
+      <w:pPr>
+        <w:pStyle w:val="Compact"/>
+        <w:numPr>
+          <w:ilvl w:val="0"/>
+          <w:numId w:val="1028"/>
+        </w:numPr>
+      </w:pPr>
+      <w:r>
+        <w:t xml:space="preserve">Записуємо</w:t>
       </w:r>
       <w:r>
         <w:t xml:space="preserve"> </w:t>
@@ -11944,11 +12117,17 @@
         </w:rPr>
         <w:t xml:space="preserve">00000101</w:t>
       </w:r>
-      <w:r>
-        <w:t xml:space="preserve"> </w:t>
-      </w:r>
-      <w:r>
-        <w:t xml:space="preserve">2. Інвертуємо всі біти (обернений код):</w:t>
+    </w:p>
+    <w:p>
+      <w:pPr>
+        <w:pStyle w:val="Compact"/>
+        <w:numPr>
+          <w:ilvl w:val="0"/>
+          <w:numId w:val="1028"/>
+        </w:numPr>
+      </w:pPr>
+      <w:r>
+        <w:t xml:space="preserve">Інвертуємо всі біти (обернений код):</w:t>
       </w:r>
       <w:r>
         <w:t xml:space="preserve"> </w:t>
@@ -11959,11 +12138,17 @@
         </w:rPr>
         <w:t xml:space="preserve">11111010</w:t>
       </w:r>
-      <w:r>
-        <w:t xml:space="preserve"> </w:t>
-      </w:r>
-      <w:r>
-        <w:t xml:space="preserve">3. Додаємо одиницю:</w:t>
+    </w:p>
+    <w:p>
+      <w:pPr>
+        <w:pStyle w:val="Compact"/>
+        <w:numPr>
+          <w:ilvl w:val="0"/>
+          <w:numId w:val="1028"/>
+        </w:numPr>
+      </w:pPr>
+      <w:r>
+        <w:t xml:space="preserve">Додаємо одиницю:</w:t>
       </w:r>
       <w:r>
         <w:t xml:space="preserve"> </w:t>
@@ -11992,7 +12177,7 @@
     </w:p>
     <w:p>
       <w:pPr>
-        <w:pStyle w:val="BodyText"/>
+        <w:pStyle w:val="Compact"/>
       </w:pPr>
       <m:oMathPara>
         <m:oMathParaPr>
@@ -12100,15 +12285,15 @@
         </w:rPr>
         <w:t xml:space="preserve">Фундаментальні переваги додаткового коду:</w:t>
       </w:r>
-      <w:r>
-        <w:t xml:space="preserve"> </w:t>
-      </w:r>
-      <w:r>
-        <w:t xml:space="preserve">1.</w:t>
-      </w:r>
-      <w:r>
-        <w:t xml:space="preserve"> </w:t>
-      </w:r>
+    </w:p>
+    <w:p>
+      <w:pPr>
+        <w:pStyle w:val="Compact"/>
+        <w:numPr>
+          <w:ilvl w:val="0"/>
+          <w:numId w:val="1029"/>
+        </w:numPr>
+      </w:pPr>
       <w:r>
         <w:rPr>
           <w:b/>
@@ -12221,15 +12406,15 @@
       <w:r>
         <w:t xml:space="preserve">. «Від’ємний нуль» усунуто математично!</w:t>
       </w:r>
-      <w:r>
-        <w:t xml:space="preserve"> </w:t>
-      </w:r>
-      <w:r>
-        <w:t xml:space="preserve">2.</w:t>
-      </w:r>
-      <w:r>
-        <w:t xml:space="preserve"> </w:t>
-      </w:r>
+    </w:p>
+    <w:p>
+      <w:pPr>
+        <w:pStyle w:val="Compact"/>
+        <w:numPr>
+          <w:ilvl w:val="0"/>
+          <w:numId w:val="1029"/>
+        </w:numPr>
+      </w:pPr>
       <w:r>
         <w:rPr>
           <w:b/>
@@ -12319,7 +12504,7 @@
     </w:p>
     <w:p>
       <w:pPr>
-        <w:pStyle w:val="BodyText"/>
+        <w:pStyle w:val="FirstParagraph"/>
       </w:pPr>
       <w:r>
         <w:rPr>
@@ -12375,15 +12560,15 @@
       <w:r>
         <w:t xml:space="preserve">у 8-розрядному АЛП:</w:t>
       </w:r>
-      <w:r>
-        <w:t xml:space="preserve"> </w:t>
-      </w:r>
-      <w:r>
-        <w:t xml:space="preserve">-</w:t>
-      </w:r>
-      <w:r>
-        <w:t xml:space="preserve"> </w:t>
-      </w:r>
+    </w:p>
+    <w:p>
+      <w:pPr>
+        <w:pStyle w:val="Compact"/>
+        <w:numPr>
+          <w:ilvl w:val="0"/>
+          <w:numId w:val="1030"/>
+        </w:numPr>
+      </w:pPr>
       <m:oMath>
         <m:r>
           <m:rPr>
@@ -12423,14 +12608,17 @@
         </m:sSub>
       </m:oMath>
       <w:r>
-        <w:t xml:space="preserve"> </w:t>
-      </w:r>
-      <w:r>
-        <w:t xml:space="preserve">-</w:t>
-      </w:r>
-      <w:r>
-        <w:t xml:space="preserve"> </w:t>
-      </w:r>
+        <w:t xml:space="preserve">​</w:t>
+      </w:r>
+    </w:p>
+    <w:p>
+      <w:pPr>
+        <w:pStyle w:val="Compact"/>
+        <w:numPr>
+          <w:ilvl w:val="0"/>
+          <w:numId w:val="1030"/>
+        </w:numPr>
+      </w:pPr>
       <m:oMath>
         <m:r>
           <m:rPr>
@@ -12470,15 +12658,24 @@
         </m:sSub>
       </m:oMath>
       <w:r>
-        <w:t xml:space="preserve"> </w:t>
-      </w:r>
-      <w:r>
-        <w:t xml:space="preserve">- Виконуємо звичайне двійкове додавання:</w:t>
-      </w:r>
-    </w:p>
-    <w:p>
-      <w:pPr>
-        <w:pStyle w:val="BodyText"/>
+        <w:t xml:space="preserve">​</w:t>
+      </w:r>
+    </w:p>
+    <w:p>
+      <w:pPr>
+        <w:pStyle w:val="Compact"/>
+        <w:numPr>
+          <w:ilvl w:val="0"/>
+          <w:numId w:val="1030"/>
+        </w:numPr>
+      </w:pPr>
+      <w:r>
+        <w:t xml:space="preserve">Виконуємо звичайне двійкове додавання:</w:t>
+      </w:r>
+    </w:p>
+    <w:p>
+      <w:pPr>
+        <w:pStyle w:val="FirstParagraph"/>
       </w:pPr>
       <m:oMathPara>
         <m:oMathParaPr>
@@ -12660,11 +12857,11 @@
       <w:pPr>
         <w:pStyle w:val="Heading4"/>
       </w:pPr>
-      <w:bookmarkStart w:id="49" w:name="_1b1cba4565862c51337a37d78a0aa1efbb57647"/>
+      <w:bookmarkStart w:id="50" w:name="_1b1cba4565862c51337a37d78a0aa1efbb57647"/>
       <w:r>
         <w:t xml:space="preserve">Г. Діапазон значень та переповнення розрядної сітки (Integer Overflow)</w:t>
       </w:r>
-      <w:bookmarkEnd w:id="49"/>
+      <w:bookmarkEnd w:id="50"/>
     </w:p>
     <w:p>
       <w:pPr>
@@ -13161,11 +13358,11 @@
       <w:pPr>
         <w:pStyle w:val="Heading1"/>
       </w:pPr>
-      <w:bookmarkStart w:id="50" w:name="_висновки"/>
+      <w:bookmarkStart w:id="51" w:name="_висновки"/>
       <w:r>
         <w:t xml:space="preserve">ВИСНОВКИ</w:t>
       </w:r>
-      <w:bookmarkEnd w:id="50"/>
+      <w:bookmarkEnd w:id="51"/>
     </w:p>
     <w:p>
       <w:pPr>
@@ -13180,7 +13377,7 @@
         <w:pStyle w:val="FirstParagraph"/>
         <w:numPr>
           <w:ilvl w:val="0"/>
-          <w:numId w:val="1012"/>
+          <w:numId w:val="1031"/>
         </w:numPr>
       </w:pPr>
       <w:r>
@@ -13216,7 +13413,7 @@
         <w:pStyle w:val="FirstParagraph"/>
         <w:numPr>
           <w:ilvl w:val="0"/>
-          <w:numId w:val="1012"/>
+          <w:numId w:val="1031"/>
         </w:numPr>
       </w:pPr>
       <w:r>
@@ -13255,7 +13452,7 @@
         <w:pStyle w:val="FirstParagraph"/>
         <w:numPr>
           <w:ilvl w:val="0"/>
-          <w:numId w:val="1012"/>
+          <w:numId w:val="1031"/>
         </w:numPr>
       </w:pPr>
       <w:r>
@@ -13317,7 +13514,7 @@
         <w:pStyle w:val="FirstParagraph"/>
         <w:numPr>
           <w:ilvl w:val="0"/>
-          <w:numId w:val="1012"/>
+          <w:numId w:val="1031"/>
         </w:numPr>
       </w:pPr>
       <w:r>
@@ -13339,7 +13536,7 @@
         <w:pStyle w:val="FirstParagraph"/>
         <w:numPr>
           <w:ilvl w:val="0"/>
-          <w:numId w:val="1012"/>
+          <w:numId w:val="1031"/>
         </w:numPr>
       </w:pPr>
       <w:r>
@@ -13367,18 +13564,18 @@
       <w:pPr>
         <w:pStyle w:val="Heading1"/>
       </w:pPr>
-      <w:bookmarkStart w:id="51" w:name="_3336b80e07207dde79fa329b46cd18e9ae899dc"/>
+      <w:bookmarkStart w:id="52" w:name="_3336b80e07207dde79fa329b46cd18e9ae899dc"/>
       <w:r>
         <w:t xml:space="preserve">СПИСОК ВИКОРИСТАНИХ ДЖЕРЕЛ</w:t>
       </w:r>
-      <w:bookmarkEnd w:id="51"/>
+      <w:bookmarkEnd w:id="52"/>
     </w:p>
     <w:p>
       <w:pPr>
         <w:pStyle w:val="Compact"/>
         <w:numPr>
           <w:ilvl w:val="0"/>
-          <w:numId w:val="1013"/>
+          <w:numId w:val="1032"/>
         </w:numPr>
       </w:pPr>
       <w:r>
@@ -13400,7 +13597,7 @@
         <w:pStyle w:val="Compact"/>
         <w:numPr>
           <w:ilvl w:val="0"/>
-          <w:numId w:val="1013"/>
+          <w:numId w:val="1032"/>
         </w:numPr>
       </w:pPr>
       <w:r>
@@ -13422,7 +13619,7 @@
         <w:pStyle w:val="Compact"/>
         <w:numPr>
           <w:ilvl w:val="0"/>
-          <w:numId w:val="1013"/>
+          <w:numId w:val="1032"/>
         </w:numPr>
       </w:pPr>
       <w:r>
@@ -13444,7 +13641,7 @@
         <w:pStyle w:val="Compact"/>
         <w:numPr>
           <w:ilvl w:val="0"/>
-          <w:numId w:val="1013"/>
+          <w:numId w:val="1032"/>
         </w:numPr>
       </w:pPr>
       <w:r>
@@ -13466,7 +13663,7 @@
         <w:pStyle w:val="Compact"/>
         <w:numPr>
           <w:ilvl w:val="0"/>
-          <w:numId w:val="1013"/>
+          <w:numId w:val="1032"/>
         </w:numPr>
       </w:pPr>
       <w:r>
@@ -13488,7 +13685,7 @@
         <w:pStyle w:val="Compact"/>
         <w:numPr>
           <w:ilvl w:val="0"/>
-          <w:numId w:val="1013"/>
+          <w:numId w:val="1032"/>
         </w:numPr>
       </w:pPr>
       <w:r>
@@ -13510,7 +13707,7 @@
         <w:pStyle w:val="Compact"/>
         <w:numPr>
           <w:ilvl w:val="0"/>
-          <w:numId w:val="1013"/>
+          <w:numId w:val="1032"/>
         </w:numPr>
       </w:pPr>
       <w:r>
@@ -13532,7 +13729,7 @@
         <w:pStyle w:val="Compact"/>
         <w:numPr>
           <w:ilvl w:val="0"/>
-          <w:numId w:val="1013"/>
+          <w:numId w:val="1032"/>
         </w:numPr>
       </w:pPr>
       <w:r>
@@ -13554,7 +13751,7 @@
         <w:pStyle w:val="Compact"/>
         <w:numPr>
           <w:ilvl w:val="0"/>
-          <w:numId w:val="1013"/>
+          <w:numId w:val="1032"/>
         </w:numPr>
       </w:pPr>
       <w:r>
@@ -13991,34 +14188,7 @@
     </w:lvlOverride>
   </w:num>
   <w:num w:numId="1009">
-    <w:abstractNumId w:val="99411"/>
-    <w:lvlOverride w:ilvl="0">
-      <w:startOverride w:val="1"/>
-    </w:lvlOverride>
-    <w:lvlOverride w:ilvl="1">
-      <w:startOverride w:val="1"/>
-    </w:lvlOverride>
-    <w:lvlOverride w:ilvl="2">
-      <w:startOverride w:val="1"/>
-    </w:lvlOverride>
-    <w:lvlOverride w:ilvl="3">
-      <w:startOverride w:val="1"/>
-    </w:lvlOverride>
-    <w:lvlOverride w:ilvl="4">
-      <w:startOverride w:val="1"/>
-    </w:lvlOverride>
-    <w:lvlOverride w:ilvl="5">
-      <w:startOverride w:val="1"/>
-    </w:lvlOverride>
-    <w:lvlOverride w:ilvl="6">
-      <w:startOverride w:val="1"/>
-    </w:lvlOverride>
-    <w:lvlOverride w:ilvl="7">
-      <w:startOverride w:val="1"/>
-    </w:lvlOverride>
-    <w:lvlOverride w:ilvl="8">
-      <w:startOverride w:val="1"/>
-    </w:lvlOverride>
+    <w:abstractNumId w:val="991"/>
   </w:num>
   <w:num w:numId="1010">
     <w:abstractNumId w:val="99411"/>
@@ -14054,6 +14224,9 @@
     <w:abstractNumId w:val="991"/>
   </w:num>
   <w:num w:numId="1012">
+    <w:abstractNumId w:val="991"/>
+  </w:num>
+  <w:num w:numId="1013">
     <w:abstractNumId w:val="99411"/>
     <w:lvlOverride w:ilvl="0">
       <w:startOverride w:val="1"/>
@@ -14083,7 +14256,277 @@
       <w:startOverride w:val="1"/>
     </w:lvlOverride>
   </w:num>
-  <w:num w:numId="1013">
+  <w:num w:numId="1014">
+    <w:abstractNumId w:val="991"/>
+  </w:num>
+  <w:num w:numId="1015">
+    <w:abstractNumId w:val="99411"/>
+    <w:lvlOverride w:ilvl="0">
+      <w:startOverride w:val="1"/>
+    </w:lvlOverride>
+    <w:lvlOverride w:ilvl="1">
+      <w:startOverride w:val="1"/>
+    </w:lvlOverride>
+    <w:lvlOverride w:ilvl="2">
+      <w:startOverride w:val="1"/>
+    </w:lvlOverride>
+    <w:lvlOverride w:ilvl="3">
+      <w:startOverride w:val="1"/>
+    </w:lvlOverride>
+    <w:lvlOverride w:ilvl="4">
+      <w:startOverride w:val="1"/>
+    </w:lvlOverride>
+    <w:lvlOverride w:ilvl="5">
+      <w:startOverride w:val="1"/>
+    </w:lvlOverride>
+    <w:lvlOverride w:ilvl="6">
+      <w:startOverride w:val="1"/>
+    </w:lvlOverride>
+    <w:lvlOverride w:ilvl="7">
+      <w:startOverride w:val="1"/>
+    </w:lvlOverride>
+    <w:lvlOverride w:ilvl="8">
+      <w:startOverride w:val="1"/>
+    </w:lvlOverride>
+  </w:num>
+  <w:num w:numId="1016">
+    <w:abstractNumId w:val="991"/>
+  </w:num>
+  <w:num w:numId="1017">
+    <w:abstractNumId w:val="99411"/>
+    <w:lvlOverride w:ilvl="0">
+      <w:startOverride w:val="1"/>
+    </w:lvlOverride>
+    <w:lvlOverride w:ilvl="1">
+      <w:startOverride w:val="1"/>
+    </w:lvlOverride>
+    <w:lvlOverride w:ilvl="2">
+      <w:startOverride w:val="1"/>
+    </w:lvlOverride>
+    <w:lvlOverride w:ilvl="3">
+      <w:startOverride w:val="1"/>
+    </w:lvlOverride>
+    <w:lvlOverride w:ilvl="4">
+      <w:startOverride w:val="1"/>
+    </w:lvlOverride>
+    <w:lvlOverride w:ilvl="5">
+      <w:startOverride w:val="1"/>
+    </w:lvlOverride>
+    <w:lvlOverride w:ilvl="6">
+      <w:startOverride w:val="1"/>
+    </w:lvlOverride>
+    <w:lvlOverride w:ilvl="7">
+      <w:startOverride w:val="1"/>
+    </w:lvlOverride>
+    <w:lvlOverride w:ilvl="8">
+      <w:startOverride w:val="1"/>
+    </w:lvlOverride>
+  </w:num>
+  <w:num w:numId="1018">
+    <w:abstractNumId w:val="991"/>
+  </w:num>
+  <w:num w:numId="1019">
+    <w:abstractNumId w:val="991"/>
+  </w:num>
+  <w:num w:numId="1020">
+    <w:abstractNumId w:val="991"/>
+  </w:num>
+  <w:num w:numId="1021">
+    <w:abstractNumId w:val="99411"/>
+    <w:lvlOverride w:ilvl="0">
+      <w:startOverride w:val="1"/>
+    </w:lvlOverride>
+    <w:lvlOverride w:ilvl="1">
+      <w:startOverride w:val="1"/>
+    </w:lvlOverride>
+    <w:lvlOverride w:ilvl="2">
+      <w:startOverride w:val="1"/>
+    </w:lvlOverride>
+    <w:lvlOverride w:ilvl="3">
+      <w:startOverride w:val="1"/>
+    </w:lvlOverride>
+    <w:lvlOverride w:ilvl="4">
+      <w:startOverride w:val="1"/>
+    </w:lvlOverride>
+    <w:lvlOverride w:ilvl="5">
+      <w:startOverride w:val="1"/>
+    </w:lvlOverride>
+    <w:lvlOverride w:ilvl="6">
+      <w:startOverride w:val="1"/>
+    </w:lvlOverride>
+    <w:lvlOverride w:ilvl="7">
+      <w:startOverride w:val="1"/>
+    </w:lvlOverride>
+    <w:lvlOverride w:ilvl="8">
+      <w:startOverride w:val="1"/>
+    </w:lvlOverride>
+  </w:num>
+  <w:num w:numId="1022">
+    <w:abstractNumId w:val="991"/>
+  </w:num>
+  <w:num w:numId="1023">
+    <w:abstractNumId w:val="991"/>
+  </w:num>
+  <w:num w:numId="1024">
+    <w:abstractNumId w:val="991"/>
+  </w:num>
+  <w:num w:numId="1025">
+    <w:abstractNumId w:val="991"/>
+  </w:num>
+  <w:num w:numId="1026">
+    <w:abstractNumId w:val="99411"/>
+    <w:lvlOverride w:ilvl="0">
+      <w:startOverride w:val="1"/>
+    </w:lvlOverride>
+    <w:lvlOverride w:ilvl="1">
+      <w:startOverride w:val="1"/>
+    </w:lvlOverride>
+    <w:lvlOverride w:ilvl="2">
+      <w:startOverride w:val="1"/>
+    </w:lvlOverride>
+    <w:lvlOverride w:ilvl="3">
+      <w:startOverride w:val="1"/>
+    </w:lvlOverride>
+    <w:lvlOverride w:ilvl="4">
+      <w:startOverride w:val="1"/>
+    </w:lvlOverride>
+    <w:lvlOverride w:ilvl="5">
+      <w:startOverride w:val="1"/>
+    </w:lvlOverride>
+    <w:lvlOverride w:ilvl="6">
+      <w:startOverride w:val="1"/>
+    </w:lvlOverride>
+    <w:lvlOverride w:ilvl="7">
+      <w:startOverride w:val="1"/>
+    </w:lvlOverride>
+    <w:lvlOverride w:ilvl="8">
+      <w:startOverride w:val="1"/>
+    </w:lvlOverride>
+  </w:num>
+  <w:num w:numId="1027">
+    <w:abstractNumId w:val="99411"/>
+    <w:lvlOverride w:ilvl="0">
+      <w:startOverride w:val="1"/>
+    </w:lvlOverride>
+    <w:lvlOverride w:ilvl="1">
+      <w:startOverride w:val="1"/>
+    </w:lvlOverride>
+    <w:lvlOverride w:ilvl="2">
+      <w:startOverride w:val="1"/>
+    </w:lvlOverride>
+    <w:lvlOverride w:ilvl="3">
+      <w:startOverride w:val="1"/>
+    </w:lvlOverride>
+    <w:lvlOverride w:ilvl="4">
+      <w:startOverride w:val="1"/>
+    </w:lvlOverride>
+    <w:lvlOverride w:ilvl="5">
+      <w:startOverride w:val="1"/>
+    </w:lvlOverride>
+    <w:lvlOverride w:ilvl="6">
+      <w:startOverride w:val="1"/>
+    </w:lvlOverride>
+    <w:lvlOverride w:ilvl="7">
+      <w:startOverride w:val="1"/>
+    </w:lvlOverride>
+    <w:lvlOverride w:ilvl="8">
+      <w:startOverride w:val="1"/>
+    </w:lvlOverride>
+  </w:num>
+  <w:num w:numId="1028">
+    <w:abstractNumId w:val="99411"/>
+    <w:lvlOverride w:ilvl="0">
+      <w:startOverride w:val="1"/>
+    </w:lvlOverride>
+    <w:lvlOverride w:ilvl="1">
+      <w:startOverride w:val="1"/>
+    </w:lvlOverride>
+    <w:lvlOverride w:ilvl="2">
+      <w:startOverride w:val="1"/>
+    </w:lvlOverride>
+    <w:lvlOverride w:ilvl="3">
+      <w:startOverride w:val="1"/>
+    </w:lvlOverride>
+    <w:lvlOverride w:ilvl="4">
+      <w:startOverride w:val="1"/>
+    </w:lvlOverride>
+    <w:lvlOverride w:ilvl="5">
+      <w:startOverride w:val="1"/>
+    </w:lvlOverride>
+    <w:lvlOverride w:ilvl="6">
+      <w:startOverride w:val="1"/>
+    </w:lvlOverride>
+    <w:lvlOverride w:ilvl="7">
+      <w:startOverride w:val="1"/>
+    </w:lvlOverride>
+    <w:lvlOverride w:ilvl="8">
+      <w:startOverride w:val="1"/>
+    </w:lvlOverride>
+  </w:num>
+  <w:num w:numId="1029">
+    <w:abstractNumId w:val="99411"/>
+    <w:lvlOverride w:ilvl="0">
+      <w:startOverride w:val="1"/>
+    </w:lvlOverride>
+    <w:lvlOverride w:ilvl="1">
+      <w:startOverride w:val="1"/>
+    </w:lvlOverride>
+    <w:lvlOverride w:ilvl="2">
+      <w:startOverride w:val="1"/>
+    </w:lvlOverride>
+    <w:lvlOverride w:ilvl="3">
+      <w:startOverride w:val="1"/>
+    </w:lvlOverride>
+    <w:lvlOverride w:ilvl="4">
+      <w:startOverride w:val="1"/>
+    </w:lvlOverride>
+    <w:lvlOverride w:ilvl="5">
+      <w:startOverride w:val="1"/>
+    </w:lvlOverride>
+    <w:lvlOverride w:ilvl="6">
+      <w:startOverride w:val="1"/>
+    </w:lvlOverride>
+    <w:lvlOverride w:ilvl="7">
+      <w:startOverride w:val="1"/>
+    </w:lvlOverride>
+    <w:lvlOverride w:ilvl="8">
+      <w:startOverride w:val="1"/>
+    </w:lvlOverride>
+  </w:num>
+  <w:num w:numId="1030">
+    <w:abstractNumId w:val="991"/>
+  </w:num>
+  <w:num w:numId="1031">
+    <w:abstractNumId w:val="99411"/>
+    <w:lvlOverride w:ilvl="0">
+      <w:startOverride w:val="1"/>
+    </w:lvlOverride>
+    <w:lvlOverride w:ilvl="1">
+      <w:startOverride w:val="1"/>
+    </w:lvlOverride>
+    <w:lvlOverride w:ilvl="2">
+      <w:startOverride w:val="1"/>
+    </w:lvlOverride>
+    <w:lvlOverride w:ilvl="3">
+      <w:startOverride w:val="1"/>
+    </w:lvlOverride>
+    <w:lvlOverride w:ilvl="4">
+      <w:startOverride w:val="1"/>
+    </w:lvlOverride>
+    <w:lvlOverride w:ilvl="5">
+      <w:startOverride w:val="1"/>
+    </w:lvlOverride>
+    <w:lvlOverride w:ilvl="6">
+      <w:startOverride w:val="1"/>
+    </w:lvlOverride>
+    <w:lvlOverride w:ilvl="7">
+      <w:startOverride w:val="1"/>
+    </w:lvlOverride>
+    <w:lvlOverride w:ilvl="8">
+      <w:startOverride w:val="1"/>
+    </w:lvlOverride>
+  </w:num>
+  <w:num w:numId="1032">
     <w:abstractNumId w:val="99411"/>
     <w:lvlOverride w:ilvl="0">
       <w:startOverride w:val="1"/>

</xml_diff>

<commit_message>
fix(docs): center page margins (20mm) and eliminate empty/orphan pages
</commit_message>
<xml_diff>
--- a/knowledge_base/domains/computer_science/referat_binary_numeral_systems.docx
+++ b/knowledge_base/domains/computer_science/referat_binary_numeral_systems.docx
@@ -488,7 +488,7 @@
         <w:t xml:space="preserve"> </w:t>
       </w:r>
       <w:r>
-        <w:t xml:space="preserve">Сучасна обчислювальна техніка, попри колосальну складність мікропроцесорних архітектур, базується на концепціях, розроблених у середині XX століття. В основі будь-якого комп’ютера — від крихітного мікроконтролера в побутовому приладі до суперкомп’ютерного кластера штучного інтелекту — лежить оперування дискретними електричними сигналами. Вибір систем числення для внутрішнього представлення даних та людино-машинної взаємодії є не випадковим конструкторським компромісом, а суворим наслідком законів фізики напівпровідників, математичної логіки та теорії інформації.</w:t>
+        <w:t xml:space="preserve">Сучасна обчислювальна техніка, попри колосальну складність архітектур процесорів, базується на концепціях середини XX століття. В основі будь-якого комп’ютера — від мікроконтролера до суперкомп’ютера — лежить оперування дискретними сигналами. Вибір систем числення для внутрішнього представлення даних та людино-машинної взаємодії є прямим наслідком законів фізики напівпровідників, математичної логіки та схемотехніки.</w:t>
       </w:r>
     </w:p>
     <w:p>
@@ -496,15 +496,7 @@
         <w:pStyle w:val="BodyText"/>
       </w:pPr>
       <w:r>
-        <w:t xml:space="preserve">З точки зору схемотехніки, створення елементної бази, здатної надійно розрізняти десять стійких рівнів електричного потенціалу (для апаратної реалізації звичної людині десяткової системи), призводить до критичного зниження завадостійкості, багаторазового ускладнення схем комутації та значних витрат енергії. Навпаки, дворівнева логіка (наявність високого потенціалу або його відсутність, логічна «1» чи логічний «0») реалізується за допомогою мінімальної кількості кремнієвих польових транзисторів, забезпечуючи граничну швидкість перемикання вентилів і максимальну стабільність до температурних і електромагнітних шумів.</w:t>
-      </w:r>
-    </w:p>
-    <w:p>
-      <w:pPr>
-        <w:pStyle w:val="BodyText"/>
-      </w:pPr>
-      <w:r>
-        <w:t xml:space="preserve">Саме тому фундаментальною основою машинної обробки інформації стала</w:t>
+        <w:t xml:space="preserve">З точки зору схемотехніки, створення елементної бази на 10 стійких рівнів напруги призводить до критичного падіння завадостійкості та ускладнення схем. Навпаки, дворівнева логіка (логічна «1» або «0») реалізується мінімальною кількістю транзисторів, забезпечуючи граничну швидкодію та максимальну надійність. Тому базисом цифрової техніки стала</w:t>
       </w:r>
       <w:r>
         <w:t xml:space="preserve"> </w:t>
@@ -517,7 +509,7 @@
         <w:t xml:space="preserve">двійкова система числення (Binary)</w:t>
       </w:r>
       <w:r>
-        <w:t xml:space="preserve">. Водночас для програмістів та інженерів пряме читання багаторозрядних бітових послідовностей є вкрай незручним. Як ергономічний міст між двійковим апаратним світом та людиною виникли</w:t>
+        <w:t xml:space="preserve">, а для компактного запису машинних слів і адрес пам’яті виникли</w:t>
       </w:r>
       <w:r>
         <w:t xml:space="preserve"> </w:t>
@@ -533,7 +525,7 @@
         <w:t xml:space="preserve"> </w:t>
       </w:r>
       <w:r>
-        <w:t xml:space="preserve">та, головним чином,</w:t>
+        <w:t xml:space="preserve">та</w:t>
       </w:r>
       <w:r>
         <w:t xml:space="preserve"> </w:t>
@@ -549,7 +541,7 @@
         <w:t xml:space="preserve"> </w:t>
       </w:r>
       <w:r>
-        <w:t xml:space="preserve">системи числення, що дозволяють компактно записувати адреси оперативної пам’яті, системні прапорці, коди операцій процесора та параметри кольорів.</w:t>
+        <w:t xml:space="preserve">системи.</w:t>
       </w:r>
     </w:p>
     <w:p>
@@ -567,7 +559,7 @@
         <w:t xml:space="preserve"> </w:t>
       </w:r>
       <w:r>
-        <w:t xml:space="preserve">— всебічно дослідити теоретичні засади систем числення, детально розглянути двійкову, вісімкову та шістнадцяткову системи в контексті комп’ютерної схемотехніки, проаналізувати алгоритми прямого та зворотного переводу чисел (включаючи схему Горнера і метод тетрад), а також вивчити специфіку виконання арифметичних операцій і кодування цілих від’ємних чисел у розрядній сітці ЕОМ (прямий, обернений та додатковий коди).</w:t>
+        <w:t xml:space="preserve">— всебічно дослідити теоретичні засади позиційних систем числення, розглянути двійкову, вісімкову та шістнадцяткову системи в контексті комп’ютерної схемотехніки, алгоритми прямого та зворотного переводу чисел, специфіку двійкової арифметики та формати кодування цілих чисел зі знаком (прямий, обернений та додатковий коди).</w:t>
       </w:r>
     </w:p>
     <w:p>
@@ -591,7 +583,7 @@
         </w:numPr>
       </w:pPr>
       <w:r>
-        <w:t xml:space="preserve">Розкрити фундаментальні відмінності між непозиційними та позиційними системами числення, вивести поліноміальну розгорнуту форму числа.</w:t>
+        <w:t xml:space="preserve">Розкрити відмінності між непозиційними та позиційними системами, вивести поліноміальну розгорнуту форму числа.</w:t>
       </w:r>
     </w:p>
     <w:p>
@@ -603,7 +595,7 @@
         </w:numPr>
       </w:pPr>
       <w:r>
-        <w:t xml:space="preserve">Проаналізувати фізичні, математичні та економічні причини вибору двійкової системи як бази цифрової електроніки.</w:t>
+        <w:t xml:space="preserve">Проаналізувати фізичні, математичні та апаратні причини домінування двійкової системи в цифровій техніці.</w:t>
       </w:r>
     </w:p>
     <w:p>
@@ -615,7 +607,7 @@
         </w:numPr>
       </w:pPr>
       <w:r>
-        <w:t xml:space="preserve">Охарактеризувати вісімкову та шістнадцяткову системи числення як засоби ущільнення двійкової інформації.</w:t>
+        <w:t xml:space="preserve">Охарактеризувати вісімкову та шістнадцяткову системи як компактні людино-орієнтовані подання бітових послідовностей.</w:t>
       </w:r>
     </w:p>
     <w:p>
@@ -627,7 +619,7 @@
         </w:numPr>
       </w:pPr>
       <w:r>
-        <w:t xml:space="preserve">Дослідити алгоритми міжсистемного переводу цілих і дробових величин, показавши природу виникнення похибок при роботі з дійсними числами.</w:t>
+        <w:t xml:space="preserve">Дослідити алгоритми переводу чисел (ділення, множення, схема Горнера, тетради) та природу похибок у форматі IEEE 754.</w:t>
       </w:r>
     </w:p>
     <w:p>
@@ -639,7 +631,7 @@
         </w:numPr>
       </w:pPr>
       <w:r>
-        <w:t xml:space="preserve">Опанувати методику порозрядного двійкового додавання й множення, а також довести математичну ефективність використання додаткового коду для усунення операції віднімання на рівні АЛП.</w:t>
+        <w:t xml:space="preserve">Опанувати двійкове додавання, множення у стовпчик та довести переваги додаткового коду для заміни віднімання додаванням.</w:t>
       </w:r>
     </w:p>
     <w:p>

</xml_diff>

<commit_message>
docs: insert in-text academic citations [1]-[9] and clickable DOI links
</commit_message>
<xml_diff>
--- a/knowledge_base/domains/computer_science/referat_binary_numeral_systems.docx
+++ b/knowledge_base/domains/computer_science/referat_binary_numeral_systems.docx
@@ -676,7 +676,7 @@
         <w:t xml:space="preserve"> </w:t>
       </w:r>
       <w:r>
-        <w:t xml:space="preserve">— це узгоджена сукупність прийомів, правил та символьних позначень, призначена для однозначного запису (кодування), іменування та арифметичної обробки кількісних величин. Символи, що використовуються для запису чисел, називають</w:t>
+        <w:t xml:space="preserve">— це узгоджена сукупність прийомів, правил та символьних позначень, призначена для однозначного запису (кодування), іменування та арифметичної обробки кількісних величин [6]. Символи, що використовуються для запису чисел, називають</w:t>
       </w:r>
       <w:r>
         <w:t xml:space="preserve"> </w:t>
@@ -2115,7 +2115,10 @@
         <w:t xml:space="preserve">розгорнутій формі (степеневому ряді)</w:t>
       </w:r>
       <w:r>
-        <w:t xml:space="preserve">:</w:t>
+        <w:t xml:space="preserve"> </w:t>
+      </w:r>
+      <w:r>
+        <w:t xml:space="preserve">[1]:</w:t>
       </w:r>
     </w:p>
     <w:p>
@@ -4121,7 +4124,7 @@
         <w:t xml:space="preserve"> </w:t>
       </w:r>
       <w:r>
-        <w:t xml:space="preserve">Між цими рівнями існує широкий діапазон невизначеності (захисний зазор), що забезпечує колосальну завадостійкість схеми.</w:t>
+        <w:t xml:space="preserve">Між цими рівнями існує широкий діапазон невизначеності (захисний зазор), що забезпечує колосальну завадостійкість схеми [4].</w:t>
       </w:r>
     </w:p>
     <w:p>
@@ -4143,7 +4146,7 @@
         <w:t xml:space="preserve"> </w:t>
       </w:r>
       <w:r>
-        <w:t xml:space="preserve">У 1937 році американський інженер і математик Клод Шеннон у своїй фундаментальній праці довів, що операції двійкової математики повністю тотожні законам математичної логіки, сформульованим Джорджем Булем у 1854 році. Будь-яка складна операція (додавання, віднімання, порівняння) зводиться до найпростіших логічних функцій:</w:t>
+        <w:t xml:space="preserve">У 1937 році американський інженер і математик Клод Шеннон у своїй фундаментальній праці довів, що операції двійкової математики повністю тотожні законам математичної логіки, сформульованим Джорджем Булем у 1854 році [9]. Будь-яка складна операція (додавання, віднімання, порівняння) зводиться до найпростіших логічних функцій:</w:t>
       </w:r>
       <w:r>
         <w:t xml:space="preserve"> </w:t>
@@ -4442,7 +4445,7 @@
         <w:t xml:space="preserve"> </w:t>
       </w:r>
       <w:r>
-        <w:t xml:space="preserve">із формуванням переносу.</w:t>
+        <w:t xml:space="preserve">із формуванням переносу [4].</w:t>
       </w:r>
     </w:p>
     <w:p>
@@ -5012,7 +5015,7 @@
         <w:t xml:space="preserve"> </w:t>
       </w:r>
       <w:r>
-        <w:t xml:space="preserve">Усі вказівники та адреси регістрів в операційних системах та зневаджувачах (GDB, IDA Pro, x64dbg) виводяться у шістнадцятковій формі (наприклад,</w:t>
+        <w:t xml:space="preserve">Усі вказівники та адреси регістрів в операційних системах [2] та зневаджувачах (GDB, IDA Pro, x64dbg) виводяться у шістнадцятковій формі (наприклад,</w:t>
       </w:r>
       <w:r>
         <w:t xml:space="preserve"> </w:t>
@@ -5645,7 +5648,7 @@
         <w:t xml:space="preserve"> </w:t>
       </w:r>
       <w:r>
-        <w:t xml:space="preserve">Схема Горнера мінімізує кількість операцій множення за рахунок дужкового групування:</w:t>
+        <w:t xml:space="preserve">Схема Горнера мінімізує кількість операцій множення за рахунок дужкового групування [1]:</w:t>
       </w:r>
     </w:p>
     <w:p>
@@ -7061,9 +7064,9 @@
       <w:pPr>
         <w:pStyle w:val="Heading4"/>
       </w:pPr>
-      <w:bookmarkStart w:id="38" w:name="_b8e6b93bf4238205d596ee4659cd3f0b2b1797e"/>
-      <w:r>
-        <w:t xml:space="preserve">Б. Алгоритм послідовного множення для правильного дробу:</w:t>
+      <w:bookmarkStart w:id="38" w:name="_b0ccc4a17d8a4bede8e31ab5a8375851afab871"/>
+      <w:r>
+        <w:t xml:space="preserve">Б. Алгоритм послідовного множення для правильного дробу [7]:</w:t>
       </w:r>
       <w:bookmarkEnd w:id="38"/>
     </w:p>
@@ -7622,9 +7625,9 @@
       <w:pPr>
         <w:pStyle w:val="Heading4"/>
       </w:pPr>
-      <w:bookmarkStart w:id="39" w:name="_d68a2f4e82cb254611bdbd0ea2529541f43aa1c"/>
-      <w:r>
-        <w:t xml:space="preserve">В. Нескінченні періодичні двійкові дроби та похибки обчислень (стандарт IEEE 754)</w:t>
+      <w:bookmarkStart w:id="39" w:name="_4830b57aa2afa832f7a2ca092d848ff2e111638"/>
+      <w:r>
+        <w:t xml:space="preserve">В. Нескінченні періодичні двійкові дроби та похибки обчислень (стандарт IEEE 754) [5]</w:t>
       </w:r>
       <w:bookmarkEnd w:id="39"/>
     </w:p>
@@ -9249,7 +9252,7 @@
       <w:pPr>
         <w:pStyle w:val="Heading2"/>
       </w:pPr>
-      <w:bookmarkStart w:id="40" w:name="_18c54411102c17845bb46537abdad4d5c0e460e"/>
+      <w:bookmarkStart w:id="40" w:name="_24cf10b5e2617c1db98813d2621476e93548248"/>
       <w:r>
         <w:t xml:space="preserve">3.2. Швидкий перехід між системами з основами</w:t>
       </w:r>
@@ -9283,7 +9286,7 @@
         <w:t xml:space="preserve"> </w:t>
       </w:r>
       <w:r>
-        <w:t xml:space="preserve">(метод тріад і тетрад)</w:t>
+        <w:t xml:space="preserve">(метод тріад і тетрад) [7, 8]</w:t>
       </w:r>
       <w:bookmarkEnd w:id="40"/>
     </w:p>
@@ -10055,7 +10058,7 @@
         <w:t xml:space="preserve">carry</w:t>
       </w:r>
       <w:r>
-        <w:t xml:space="preserve">):</w:t>
+        <w:t xml:space="preserve">) [4]:</w:t>
       </w:r>
     </w:p>
     <w:p>
@@ -10635,7 +10638,7 @@
         <w:br/>
       </w:r>
       <w:r>
-        <w:t xml:space="preserve">В апаратній архітектурі процесора саме цей принцип зсуву та додавання реалізують спеціалізовані апаратні конвеєрні помножувачі та помножувачі за алгоритмом Бута (Booth’s algorithm).</w:t>
+        <w:t xml:space="preserve">В апаратній архітектурі процесора саме цей принцип зсуву та додавання реалізують спеціалізовані апаратні конвеєрні помножувачі та помножувачі за алгоритмом Бута (Booth’s algorithm) [3].</w:t>
       </w:r>
     </w:p>
     <w:p>
@@ -10757,7 +10760,7 @@
         <w:pStyle w:val="FirstParagraph"/>
       </w:pPr>
       <w:r>
-        <w:t xml:space="preserve">В історії розвитку обчислювальної техніки застосовувалися три формати кодування цілих чисел зі знаком.</w:t>
+        <w:t xml:space="preserve">В історії розвитку обчислювальної техніки застосовувалися три формати кодування цілих чисел зі знаком [2, 7].</w:t>
       </w:r>
     </w:p>
     <w:p>
@@ -12842,7 +12845,7 @@
         </m:sSub>
       </m:oMath>
       <w:r>
-        <w:t xml:space="preserve">. Обчислення виконано суматором без будь-яких додаткових блоків віднімання!</w:t>
+        <w:t xml:space="preserve">. Обчислення виконано суматором без будь-яких додаткових блоків віднімання [3, 7]!</w:t>
       </w:r>
     </w:p>
     <w:p>
@@ -13669,7 +13672,21 @@
         <w:t xml:space="preserve"> </w:t>
       </w:r>
       <w:r>
-        <w:t xml:space="preserve">IEEE Standard for Floating-Point Arithmetic. New York: IEEE Computer Society, 2019. 84 p. DOI: https://doi.org/10.1109/IEEESTD.2019.8766229.</w:t>
+        <w:t xml:space="preserve">IEEE Standard for Floating-Point Arithmetic. New York: IEEE Computer Society, 2019. 84 p. DOI:</w:t>
+      </w:r>
+      <w:r>
+        <w:t xml:space="preserve"> </w:t>
+      </w:r>
+      <w:hyperlink r:id="rId53">
+        <w:r>
+          <w:rPr>
+            <w:rStyle w:val="Hyperlink"/>
+          </w:rPr>
+          <w:t xml:space="preserve">10.1109/IEEESTD.2019.8766229</w:t>
+        </w:r>
+      </w:hyperlink>
+      <w:r>
+        <w:t xml:space="preserve">.</w:t>
       </w:r>
     </w:p>
     <w:p>
@@ -13770,7 +13787,21 @@
         <w:t xml:space="preserve">Transactions of the American Institute of Electrical Engineers</w:t>
       </w:r>
       <w:r>
-        <w:t xml:space="preserve">. 1938. Vol. 57, no. 12. P. 713–723. DOI: https://doi.org/10.1109/T-AIEE.1938.5057767.</w:t>
+        <w:t xml:space="preserve">. 1938. Vol. 57, no. 12. P. 713–723. DOI:</w:t>
+      </w:r>
+      <w:r>
+        <w:t xml:space="preserve"> </w:t>
+      </w:r>
+      <w:hyperlink r:id="rId54">
+        <w:r>
+          <w:rPr>
+            <w:rStyle w:val="Hyperlink"/>
+          </w:rPr>
+          <w:t xml:space="preserve">10.1109/T-AIEE.1938.5057767</w:t>
+        </w:r>
+      </w:hyperlink>
+      <w:r>
+        <w:t xml:space="preserve">.</w:t>
       </w:r>
     </w:p>
     <w:sectPr>

</xml_diff>